<commit_message>
updated the collaboration plan
</commit_message>
<xml_diff>
--- a/Collaboration Plan.docx
+++ b/Collaboration Plan.docx
@@ -4,429 +4,486 @@
   <w:body>
     <w:p>
       <w:pPr>
-        <w:spacing w:before="100" w:beforeAutospacing="1" w:after="100" w:afterAutospacing="1" w:line="240" w:lineRule="auto"/>
-        <w:jc w:val="both"/>
-        <w:outlineLvl w:val="0"/>
+        <w:pStyle w:val="Title"/>
         <w:rPr>
-          <w:rFonts w:ascii="Times New Roman" w:eastAsia="Times New Roman" w:hAnsi="Times New Roman" w:cs="Times New Roman"/>
-          <w:b/>
-          <w:bCs/>
-          <w:kern w:val="36"/>
-          <w:sz w:val="28"/>
-          <w:szCs w:val="28"/>
-          <w:lang w:eastAsia="en-GB"/>
-          <w14:ligatures w14:val="none"/>
+          <w:rFonts w:ascii="Times New Roman" w:hAnsi="Times New Roman" w:cs="Times New Roman"/>
+          <w:sz w:val="44"/>
+          <w:szCs w:val="44"/>
         </w:rPr>
       </w:pPr>
       <w:r>
         <w:rPr>
-          <w:rFonts w:ascii="Times New Roman" w:eastAsia="Times New Roman" w:hAnsi="Times New Roman" w:cs="Times New Roman"/>
-          <w:b/>
-          <w:bCs/>
-          <w:kern w:val="36"/>
-          <w:sz w:val="28"/>
-          <w:szCs w:val="28"/>
-          <w:lang w:eastAsia="en-GB"/>
-          <w14:ligatures w14:val="none"/>
+          <w:rFonts w:ascii="Times New Roman" w:hAnsi="Times New Roman" w:cs="Times New Roman"/>
+          <w:sz w:val="44"/>
+          <w:szCs w:val="44"/>
         </w:rPr>
-        <w:t>Collaboration Plan – Python Data Visualization Assignment</w:t>
-      </w:r>
-      <w:r>
-        <w:rPr>
-          <w:rFonts w:ascii="Times New Roman" w:eastAsia="Times New Roman" w:hAnsi="Times New Roman" w:cs="Times New Roman"/>
-          <w:b/>
-          <w:bCs/>
-          <w:kern w:val="36"/>
-          <w:sz w:val="28"/>
-          <w:szCs w:val="28"/>
-          <w:lang w:eastAsia="en-GB"/>
-          <w14:ligatures w14:val="none"/>
-        </w:rPr>
-        <w:t xml:space="preserve"> 02</w:t>
+        <w:t>Collaboration Plan – Python Data Visualization Assignment 02</w:t>
       </w:r>
     </w:p>
     <w:p>
       <w:pPr>
-        <w:spacing w:before="100" w:beforeAutospacing="1" w:after="100" w:afterAutospacing="1" w:line="240" w:lineRule="auto"/>
-        <w:jc w:val="both"/>
-        <w:outlineLvl w:val="1"/>
+        <w:pStyle w:val="Heading1"/>
         <w:rPr>
-          <w:rFonts w:ascii="Times New Roman" w:eastAsia="Times New Roman" w:hAnsi="Times New Roman" w:cs="Times New Roman"/>
-          <w:b/>
-          <w:bCs/>
-          <w:kern w:val="0"/>
-          <w:lang w:eastAsia="en-GB"/>
-          <w14:ligatures w14:val="none"/>
+          <w:rFonts w:ascii="Times New Roman" w:hAnsi="Times New Roman" w:cs="Times New Roman"/>
+          <w:sz w:val="32"/>
+          <w:szCs w:val="32"/>
         </w:rPr>
       </w:pPr>
       <w:r>
         <w:rPr>
-          <w:rFonts w:ascii="Times New Roman" w:eastAsia="Times New Roman" w:hAnsi="Times New Roman" w:cs="Times New Roman"/>
-          <w:b/>
-          <w:bCs/>
-          <w:kern w:val="0"/>
-          <w:lang w:eastAsia="en-GB"/>
-          <w14:ligatures w14:val="none"/>
+          <w:rFonts w:ascii="Times New Roman" w:hAnsi="Times New Roman" w:cs="Times New Roman"/>
+          <w:sz w:val="32"/>
+          <w:szCs w:val="32"/>
         </w:rPr>
         <w:t>Collaboration Approach</w:t>
       </w:r>
     </w:p>
     <w:p>
       <w:pPr>
-        <w:spacing w:before="100" w:beforeAutospacing="1" w:after="100" w:afterAutospacing="1" w:line="240" w:lineRule="auto"/>
+        <w:spacing w:after="120"/>
         <w:jc w:val="both"/>
         <w:rPr>
-          <w:rFonts w:ascii="Times New Roman" w:eastAsia="Times New Roman" w:hAnsi="Times New Roman" w:cs="Times New Roman"/>
-          <w:kern w:val="0"/>
-          <w:lang w:eastAsia="en-GB"/>
-          <w14:ligatures w14:val="none"/>
+          <w:rFonts w:ascii="Times New Roman" w:hAnsi="Times New Roman" w:cs="Times New Roman"/>
         </w:rPr>
       </w:pPr>
       <w:r>
         <w:rPr>
-          <w:rFonts w:ascii="Times New Roman" w:eastAsia="Times New Roman" w:hAnsi="Times New Roman" w:cs="Times New Roman"/>
-          <w:kern w:val="0"/>
-          <w:lang w:eastAsia="en-GB"/>
-          <w14:ligatures w14:val="none"/>
+          <w:rFonts w:ascii="Times New Roman" w:hAnsi="Times New Roman" w:cs="Times New Roman"/>
         </w:rPr>
         <w:t>The assignment includes laboratory exercises, Python dashboard development, and project ideation and proposal. Both students will contribute through individual task completion, peer review, and shared quality assurance.</w:t>
       </w:r>
     </w:p>
     <w:p>
       <w:pPr>
-        <w:spacing w:before="100" w:beforeAutospacing="1" w:after="100" w:afterAutospacing="1" w:line="240" w:lineRule="auto"/>
-        <w:jc w:val="both"/>
+        <w:pStyle w:val="Heading1"/>
         <w:rPr>
-          <w:rFonts w:ascii="Times New Roman" w:eastAsia="Times New Roman" w:hAnsi="Times New Roman" w:cs="Times New Roman"/>
-          <w:kern w:val="0"/>
-          <w:lang w:eastAsia="en-GB"/>
-          <w14:ligatures w14:val="none"/>
+          <w:rFonts w:ascii="Times New Roman" w:hAnsi="Times New Roman" w:cs="Times New Roman"/>
+          <w:sz w:val="32"/>
+          <w:szCs w:val="32"/>
         </w:rPr>
       </w:pPr>
       <w:r>
         <w:rPr>
-          <w:rFonts w:ascii="Times New Roman" w:eastAsia="Times New Roman" w:hAnsi="Times New Roman" w:cs="Times New Roman"/>
-          <w:b/>
-          <w:bCs/>
-          <w:kern w:val="0"/>
-          <w:lang w:eastAsia="en-GB"/>
-          <w14:ligatures w14:val="none"/>
+          <w:rFonts w:ascii="Times New Roman" w:hAnsi="Times New Roman" w:cs="Times New Roman"/>
+          <w:sz w:val="32"/>
+          <w:szCs w:val="32"/>
         </w:rPr>
         <w:t>Objective</w:t>
-      </w:r>
-      <w:r>
-        <w:rPr>
-          <w:rFonts w:ascii="Times New Roman" w:eastAsia="Times New Roman" w:hAnsi="Times New Roman" w:cs="Times New Roman"/>
-          <w:kern w:val="0"/>
-          <w:lang w:eastAsia="en-GB"/>
-          <w14:ligatures w14:val="none"/>
-        </w:rPr>
-        <w:t xml:space="preserve"> </w:t>
       </w:r>
     </w:p>
     <w:p>
       <w:pPr>
-        <w:spacing w:before="100" w:beforeAutospacing="1" w:after="100" w:afterAutospacing="1" w:line="240" w:lineRule="auto"/>
+        <w:spacing w:after="120"/>
         <w:jc w:val="both"/>
         <w:rPr>
-          <w:rFonts w:ascii="Times New Roman" w:eastAsia="Times New Roman" w:hAnsi="Times New Roman" w:cs="Times New Roman"/>
-          <w:kern w:val="0"/>
-          <w:lang w:eastAsia="en-GB"/>
-          <w14:ligatures w14:val="none"/>
+          <w:rFonts w:ascii="Times New Roman" w:hAnsi="Times New Roman" w:cs="Times New Roman"/>
         </w:rPr>
       </w:pPr>
       <w:r>
         <w:rPr>
-          <w:rFonts w:ascii="Times New Roman" w:eastAsia="Times New Roman" w:hAnsi="Times New Roman" w:cs="Times New Roman"/>
-          <w:kern w:val="0"/>
-          <w:lang w:eastAsia="en-GB"/>
-          <w14:ligatures w14:val="none"/>
+          <w:rFonts w:ascii="Times New Roman" w:hAnsi="Times New Roman" w:cs="Times New Roman"/>
         </w:rPr>
         <w:t>To ensure efficient collaboration, equitable contributions, reproducible analysis, and high-quality deliverables.</w:t>
       </w:r>
     </w:p>
     <w:p>
       <w:pPr>
-        <w:spacing w:before="100" w:beforeAutospacing="1" w:after="100" w:afterAutospacing="1" w:line="240" w:lineRule="auto"/>
-        <w:jc w:val="both"/>
-        <w:outlineLvl w:val="1"/>
+        <w:pStyle w:val="Heading1"/>
         <w:rPr>
-          <w:rFonts w:ascii="Times New Roman" w:eastAsia="Times New Roman" w:hAnsi="Times New Roman" w:cs="Times New Roman"/>
-          <w:b/>
-          <w:bCs/>
-          <w:kern w:val="0"/>
-          <w:lang w:eastAsia="en-GB"/>
-          <w14:ligatures w14:val="none"/>
+          <w:rFonts w:ascii="Times New Roman" w:hAnsi="Times New Roman" w:cs="Times New Roman"/>
+          <w:sz w:val="32"/>
+          <w:szCs w:val="32"/>
         </w:rPr>
       </w:pPr>
       <w:r>
         <w:rPr>
-          <w:rFonts w:ascii="Times New Roman" w:eastAsia="Times New Roman" w:hAnsi="Times New Roman" w:cs="Times New Roman"/>
-          <w:b/>
-          <w:bCs/>
-          <w:kern w:val="0"/>
-          <w:lang w:eastAsia="en-GB"/>
-          <w14:ligatures w14:val="none"/>
+          <w:rFonts w:ascii="Times New Roman" w:hAnsi="Times New Roman" w:cs="Times New Roman"/>
+          <w:sz w:val="32"/>
+          <w:szCs w:val="32"/>
         </w:rPr>
         <w:t>Collaboration and Responsibilities</w:t>
       </w:r>
     </w:p>
     <w:tbl>
       <w:tblPr>
-        <w:tblStyle w:val="TableGrid"/>
-        <w:tblW w:w="0" w:type="auto"/>
-        <w:tblLook w:val="04A0" w:firstRow="1" w:lastRow="0" w:firstColumn="1" w:lastColumn="0" w:noHBand="0" w:noVBand="1"/>
+        <w:tblW w:w="9026" w:type="dxa"/>
+        <w:tblBorders>
+          <w:top w:val="single" w:sz="4" w:space="0" w:color="auto"/>
+          <w:left w:val="single" w:sz="4" w:space="0" w:color="auto"/>
+          <w:bottom w:val="single" w:sz="4" w:space="0" w:color="auto"/>
+          <w:right w:val="single" w:sz="4" w:space="0" w:color="auto"/>
+          <w:insideH w:val="single" w:sz="4" w:space="0" w:color="auto"/>
+          <w:insideV w:val="single" w:sz="4" w:space="0" w:color="auto"/>
+        </w:tblBorders>
+        <w:tblCellMar>
+          <w:left w:w="10" w:type="dxa"/>
+          <w:right w:w="10" w:type="dxa"/>
+        </w:tblCellMar>
+        <w:tblLook w:val="0000" w:firstRow="0" w:lastRow="0" w:firstColumn="0" w:lastColumn="0" w:noHBand="0" w:noVBand="0"/>
       </w:tblPr>
       <w:tblGrid>
-        <w:gridCol w:w="1806"/>
-        <w:gridCol w:w="7210"/>
+        <w:gridCol w:w="2400"/>
+        <w:gridCol w:w="6626"/>
       </w:tblGrid>
       <w:tr>
-        <w:tc>
-          <w:tcPr>
-            <w:tcW w:w="0" w:type="auto"/>
-            <w:hideMark/>
-          </w:tcPr>
-          <w:p>
-            <w:pPr>
-              <w:jc w:val="both"/>
-              <w:rPr>
-                <w:rFonts w:ascii="Times New Roman" w:eastAsia="Times New Roman" w:hAnsi="Times New Roman" w:cs="Times New Roman"/>
+        <w:tblPrEx>
+          <w:tblCellMar>
+            <w:top w:w="0" w:type="dxa"/>
+            <w:bottom w:w="0" w:type="dxa"/>
+          </w:tblCellMar>
+        </w:tblPrEx>
+        <w:trPr>
+          <w:tblHeader/>
+        </w:trPr>
+        <w:tc>
+          <w:tcPr>
+            <w:tcW w:w="2400" w:type="dxa"/>
+            <w:tcBorders>
+              <w:top w:val="single" w:sz="4" w:space="0" w:color="999999"/>
+              <w:left w:val="single" w:sz="4" w:space="0" w:color="999999"/>
+              <w:bottom w:val="single" w:sz="4" w:space="0" w:color="999999"/>
+              <w:right w:val="single" w:sz="4" w:space="0" w:color="999999"/>
+            </w:tcBorders>
+            <w:shd w:val="clear" w:color="auto" w:fill="D9E2F3"/>
+            <w:tcMar>
+              <w:top w:w="80" w:type="dxa"/>
+              <w:left w:w="120" w:type="dxa"/>
+              <w:bottom w:w="80" w:type="dxa"/>
+              <w:right w:w="120" w:type="dxa"/>
+            </w:tcMar>
+          </w:tcPr>
+          <w:p>
+            <w:pPr>
+              <w:jc w:val="both"/>
+              <w:rPr>
+                <w:rFonts w:ascii="Times New Roman" w:hAnsi="Times New Roman" w:cs="Times New Roman"/>
+              </w:rPr>
+            </w:pPr>
+            <w:r>
+              <w:rPr>
+                <w:rFonts w:ascii="Times New Roman" w:hAnsi="Times New Roman" w:cs="Times New Roman"/>
                 <w:b/>
                 <w:bCs/>
-                <w:kern w:val="0"/>
-                <w:lang w:eastAsia="en-GB"/>
-                <w14:ligatures w14:val="none"/>
-              </w:rPr>
-            </w:pPr>
-            <w:r>
-              <w:rPr>
-                <w:rFonts w:ascii="Times New Roman" w:eastAsia="Times New Roman" w:hAnsi="Times New Roman" w:cs="Times New Roman"/>
+              </w:rPr>
+              <w:t>Component</w:t>
+            </w:r>
+          </w:p>
+        </w:tc>
+        <w:tc>
+          <w:tcPr>
+            <w:tcW w:w="6626" w:type="dxa"/>
+            <w:tcBorders>
+              <w:top w:val="single" w:sz="4" w:space="0" w:color="999999"/>
+              <w:left w:val="single" w:sz="4" w:space="0" w:color="999999"/>
+              <w:bottom w:val="single" w:sz="4" w:space="0" w:color="999999"/>
+              <w:right w:val="single" w:sz="4" w:space="0" w:color="999999"/>
+            </w:tcBorders>
+            <w:shd w:val="clear" w:color="auto" w:fill="D9E2F3"/>
+            <w:tcMar>
+              <w:top w:w="80" w:type="dxa"/>
+              <w:left w:w="120" w:type="dxa"/>
+              <w:bottom w:w="80" w:type="dxa"/>
+              <w:right w:w="120" w:type="dxa"/>
+            </w:tcMar>
+          </w:tcPr>
+          <w:p>
+            <w:pPr>
+              <w:jc w:val="both"/>
+              <w:rPr>
+                <w:rFonts w:ascii="Times New Roman" w:hAnsi="Times New Roman" w:cs="Times New Roman"/>
+              </w:rPr>
+            </w:pPr>
+            <w:r>
+              <w:rPr>
+                <w:rFonts w:ascii="Times New Roman" w:hAnsi="Times New Roman" w:cs="Times New Roman"/>
                 <w:b/>
                 <w:bCs/>
-                <w:kern w:val="0"/>
-                <w:lang w:eastAsia="en-GB"/>
-                <w14:ligatures w14:val="none"/>
-              </w:rPr>
-              <w:t>Component</w:t>
-            </w:r>
-          </w:p>
-        </w:tc>
-        <w:tc>
-          <w:tcPr>
-            <w:tcW w:w="0" w:type="auto"/>
-            <w:hideMark/>
-          </w:tcPr>
-          <w:p>
-            <w:pPr>
-              <w:jc w:val="both"/>
-              <w:rPr>
-                <w:rFonts w:ascii="Times New Roman" w:eastAsia="Times New Roman" w:hAnsi="Times New Roman" w:cs="Times New Roman"/>
+              </w:rPr>
+              <w:t>Collaboration approach</w:t>
+            </w:r>
+          </w:p>
+        </w:tc>
+      </w:tr>
+      <w:tr>
+        <w:tblPrEx>
+          <w:tblCellMar>
+            <w:top w:w="0" w:type="dxa"/>
+            <w:bottom w:w="0" w:type="dxa"/>
+          </w:tblCellMar>
+        </w:tblPrEx>
+        <w:tc>
+          <w:tcPr>
+            <w:tcW w:w="2400" w:type="dxa"/>
+            <w:tcBorders>
+              <w:top w:val="single" w:sz="4" w:space="0" w:color="999999"/>
+              <w:left w:val="single" w:sz="4" w:space="0" w:color="999999"/>
+              <w:bottom w:val="single" w:sz="4" w:space="0" w:color="999999"/>
+              <w:right w:val="single" w:sz="4" w:space="0" w:color="999999"/>
+            </w:tcBorders>
+            <w:tcMar>
+              <w:top w:w="80" w:type="dxa"/>
+              <w:left w:w="120" w:type="dxa"/>
+              <w:bottom w:w="80" w:type="dxa"/>
+              <w:right w:w="120" w:type="dxa"/>
+            </w:tcMar>
+          </w:tcPr>
+          <w:p>
+            <w:pPr>
+              <w:jc w:val="both"/>
+              <w:rPr>
+                <w:rFonts w:ascii="Times New Roman" w:hAnsi="Times New Roman" w:cs="Times New Roman"/>
+              </w:rPr>
+            </w:pPr>
+            <w:r>
+              <w:rPr>
+                <w:rFonts w:ascii="Times New Roman" w:hAnsi="Times New Roman" w:cs="Times New Roman"/>
                 <w:b/>
                 <w:bCs/>
-                <w:kern w:val="0"/>
-                <w:lang w:eastAsia="en-GB"/>
-                <w14:ligatures w14:val="none"/>
-              </w:rPr>
-            </w:pPr>
-            <w:r>
-              <w:rPr>
-                <w:rFonts w:ascii="Times New Roman" w:eastAsia="Times New Roman" w:hAnsi="Times New Roman" w:cs="Times New Roman"/>
+              </w:rPr>
+              <w:t>Laboratory exercises</w:t>
+            </w:r>
+          </w:p>
+        </w:tc>
+        <w:tc>
+          <w:tcPr>
+            <w:tcW w:w="6626" w:type="dxa"/>
+            <w:tcBorders>
+              <w:top w:val="single" w:sz="4" w:space="0" w:color="999999"/>
+              <w:left w:val="single" w:sz="4" w:space="0" w:color="999999"/>
+              <w:bottom w:val="single" w:sz="4" w:space="0" w:color="999999"/>
+              <w:right w:val="single" w:sz="4" w:space="0" w:color="999999"/>
+            </w:tcBorders>
+            <w:tcMar>
+              <w:top w:w="80" w:type="dxa"/>
+              <w:left w:w="120" w:type="dxa"/>
+              <w:bottom w:w="80" w:type="dxa"/>
+              <w:right w:w="120" w:type="dxa"/>
+            </w:tcMar>
+          </w:tcPr>
+          <w:p>
+            <w:pPr>
+              <w:jc w:val="both"/>
+              <w:rPr>
+                <w:rFonts w:ascii="Times New Roman" w:hAnsi="Times New Roman" w:cs="Times New Roman"/>
+              </w:rPr>
+            </w:pPr>
+            <w:r>
+              <w:rPr>
+                <w:rFonts w:ascii="Times New Roman" w:hAnsi="Times New Roman" w:cs="Times New Roman"/>
+              </w:rPr>
+              <w:t>Exercises will be divided between the students using the datasets provided by the instructor. Each student will cross-check the other's work for code correctness, calculation accuracy, visualization quality, and interpretation before submission.</w:t>
+            </w:r>
+            <w:r>
+              <w:rPr>
+                <w:rFonts w:ascii="Times New Roman" w:hAnsi="Times New Roman" w:cs="Times New Roman"/>
+              </w:rPr>
+              <w:t xml:space="preserve"> The allocation is reflected under </w:t>
+            </w:r>
+            <w:hyperlink w:anchor="_Laboratory_Exercise_Allocation" w:history="1">
+              <w:r>
+                <w:rPr>
+                  <w:rStyle w:val="Hyperlink"/>
+                  <w:rFonts w:ascii="Times New Roman" w:hAnsi="Times New Roman" w:cs="Times New Roman"/>
+                </w:rPr>
+                <w:t>laboratory exercise allo</w:t>
+              </w:r>
+              <w:r>
+                <w:rPr>
+                  <w:rStyle w:val="Hyperlink"/>
+                  <w:rFonts w:ascii="Times New Roman" w:hAnsi="Times New Roman" w:cs="Times New Roman"/>
+                </w:rPr>
+                <w:t>c</w:t>
+              </w:r>
+              <w:r>
+                <w:rPr>
+                  <w:rStyle w:val="Hyperlink"/>
+                  <w:rFonts w:ascii="Times New Roman" w:hAnsi="Times New Roman" w:cs="Times New Roman"/>
+                </w:rPr>
+                <w:t>ation.</w:t>
+              </w:r>
+            </w:hyperlink>
+          </w:p>
+        </w:tc>
+      </w:tr>
+      <w:tr>
+        <w:tblPrEx>
+          <w:tblCellMar>
+            <w:top w:w="0" w:type="dxa"/>
+            <w:bottom w:w="0" w:type="dxa"/>
+          </w:tblCellMar>
+        </w:tblPrEx>
+        <w:tc>
+          <w:tcPr>
+            <w:tcW w:w="2400" w:type="dxa"/>
+            <w:tcBorders>
+              <w:top w:val="single" w:sz="4" w:space="0" w:color="999999"/>
+              <w:left w:val="single" w:sz="4" w:space="0" w:color="999999"/>
+              <w:bottom w:val="single" w:sz="4" w:space="0" w:color="999999"/>
+              <w:right w:val="single" w:sz="4" w:space="0" w:color="999999"/>
+            </w:tcBorders>
+            <w:tcMar>
+              <w:top w:w="80" w:type="dxa"/>
+              <w:left w:w="120" w:type="dxa"/>
+              <w:bottom w:w="80" w:type="dxa"/>
+              <w:right w:w="120" w:type="dxa"/>
+            </w:tcMar>
+          </w:tcPr>
+          <w:p>
+            <w:pPr>
+              <w:jc w:val="both"/>
+              <w:rPr>
+                <w:rFonts w:ascii="Times New Roman" w:hAnsi="Times New Roman" w:cs="Times New Roman"/>
+              </w:rPr>
+            </w:pPr>
+            <w:r>
+              <w:rPr>
+                <w:rFonts w:ascii="Times New Roman" w:hAnsi="Times New Roman" w:cs="Times New Roman"/>
                 <w:b/>
                 <w:bCs/>
-                <w:kern w:val="0"/>
-                <w:lang w:eastAsia="en-GB"/>
-                <w14:ligatures w14:val="none"/>
-              </w:rPr>
-              <w:t>Collaboration approach</w:t>
+              </w:rPr>
+              <w:t>Dashboard development</w:t>
+            </w:r>
+          </w:p>
+        </w:tc>
+        <w:tc>
+          <w:tcPr>
+            <w:tcW w:w="6626" w:type="dxa"/>
+            <w:tcBorders>
+              <w:top w:val="single" w:sz="4" w:space="0" w:color="999999"/>
+              <w:left w:val="single" w:sz="4" w:space="0" w:color="999999"/>
+              <w:bottom w:val="single" w:sz="4" w:space="0" w:color="999999"/>
+              <w:right w:val="single" w:sz="4" w:space="0" w:color="999999"/>
+            </w:tcBorders>
+            <w:tcMar>
+              <w:top w:w="80" w:type="dxa"/>
+              <w:left w:w="120" w:type="dxa"/>
+              <w:bottom w:w="80" w:type="dxa"/>
+              <w:right w:w="120" w:type="dxa"/>
+            </w:tcMar>
+          </w:tcPr>
+          <w:p>
+            <w:pPr>
+              <w:jc w:val="both"/>
+              <w:rPr>
+                <w:rFonts w:ascii="Times New Roman" w:hAnsi="Times New Roman" w:cs="Times New Roman"/>
+              </w:rPr>
+            </w:pPr>
+            <w:r>
+              <w:rPr>
+                <w:rFonts w:ascii="Times New Roman" w:hAnsi="Times New Roman" w:cs="Times New Roman"/>
+              </w:rPr>
+              <w:t>As dashboard development is a new topic in the course, both students will learn and implement the concepts collaboratively. They will jointly develop visualizations, explore interactive features, troubleshoot issues, and test the dashboard to ensure accuracy and usability.</w:t>
             </w:r>
           </w:p>
         </w:tc>
       </w:tr>
       <w:tr>
-        <w:tc>
-          <w:tcPr>
-            <w:tcW w:w="0" w:type="auto"/>
-            <w:hideMark/>
-          </w:tcPr>
-          <w:p>
-            <w:pPr>
-              <w:jc w:val="both"/>
-              <w:rPr>
-                <w:rFonts w:ascii="Times New Roman" w:eastAsia="Times New Roman" w:hAnsi="Times New Roman" w:cs="Times New Roman"/>
-                <w:kern w:val="0"/>
-                <w:lang w:eastAsia="en-GB"/>
-                <w14:ligatures w14:val="none"/>
-              </w:rPr>
-            </w:pPr>
-            <w:r>
-              <w:rPr>
-                <w:rFonts w:ascii="Times New Roman" w:eastAsia="Times New Roman" w:hAnsi="Times New Roman" w:cs="Times New Roman"/>
-                <w:kern w:val="0"/>
-                <w:lang w:eastAsia="en-GB"/>
-                <w14:ligatures w14:val="none"/>
-              </w:rPr>
-              <w:t>Laboratory exercises</w:t>
-            </w:r>
-          </w:p>
-        </w:tc>
-        <w:tc>
-          <w:tcPr>
-            <w:tcW w:w="0" w:type="auto"/>
-            <w:hideMark/>
-          </w:tcPr>
-          <w:p>
-            <w:pPr>
-              <w:jc w:val="both"/>
-              <w:rPr>
-                <w:rFonts w:ascii="Times New Roman" w:eastAsia="Times New Roman" w:hAnsi="Times New Roman" w:cs="Times New Roman"/>
-                <w:kern w:val="0"/>
-                <w:lang w:eastAsia="en-GB"/>
-                <w14:ligatures w14:val="none"/>
-              </w:rPr>
-            </w:pPr>
-            <w:r>
-              <w:rPr>
-                <w:rFonts w:ascii="Times New Roman" w:eastAsia="Times New Roman" w:hAnsi="Times New Roman" w:cs="Times New Roman"/>
-                <w:kern w:val="0"/>
-                <w:lang w:eastAsia="en-GB"/>
-                <w14:ligatures w14:val="none"/>
-              </w:rPr>
-              <w:t>Exercises will be divided between the students using the datasets provided by the instructor. Each student will cross-check the other's work for code correctness, calculation accuracy, visualization quality, and interpretation before submission.</w:t>
+        <w:tblPrEx>
+          <w:tblCellMar>
+            <w:top w:w="0" w:type="dxa"/>
+            <w:bottom w:w="0" w:type="dxa"/>
+          </w:tblCellMar>
+        </w:tblPrEx>
+        <w:tc>
+          <w:tcPr>
+            <w:tcW w:w="2400" w:type="dxa"/>
+            <w:tcBorders>
+              <w:top w:val="single" w:sz="4" w:space="0" w:color="999999"/>
+              <w:left w:val="single" w:sz="4" w:space="0" w:color="999999"/>
+              <w:bottom w:val="single" w:sz="4" w:space="0" w:color="999999"/>
+              <w:right w:val="single" w:sz="4" w:space="0" w:color="999999"/>
+            </w:tcBorders>
+            <w:tcMar>
+              <w:top w:w="80" w:type="dxa"/>
+              <w:left w:w="120" w:type="dxa"/>
+              <w:bottom w:w="80" w:type="dxa"/>
+              <w:right w:w="120" w:type="dxa"/>
+            </w:tcMar>
+          </w:tcPr>
+          <w:p>
+            <w:pPr>
+              <w:jc w:val="both"/>
+              <w:rPr>
+                <w:rFonts w:ascii="Times New Roman" w:hAnsi="Times New Roman" w:cs="Times New Roman"/>
+              </w:rPr>
+            </w:pPr>
+            <w:r>
+              <w:rPr>
+                <w:rFonts w:ascii="Times New Roman" w:hAnsi="Times New Roman" w:cs="Times New Roman"/>
+                <w:b/>
+                <w:bCs/>
+              </w:rPr>
+              <w:t>Project ideation and proposal</w:t>
+            </w:r>
+          </w:p>
+        </w:tc>
+        <w:tc>
+          <w:tcPr>
+            <w:tcW w:w="6626" w:type="dxa"/>
+            <w:tcBorders>
+              <w:top w:val="single" w:sz="4" w:space="0" w:color="999999"/>
+              <w:left w:val="single" w:sz="4" w:space="0" w:color="999999"/>
+              <w:bottom w:val="single" w:sz="4" w:space="0" w:color="999999"/>
+              <w:right w:val="single" w:sz="4" w:space="0" w:color="999999"/>
+            </w:tcBorders>
+            <w:tcMar>
+              <w:top w:w="80" w:type="dxa"/>
+              <w:left w:w="120" w:type="dxa"/>
+              <w:bottom w:w="80" w:type="dxa"/>
+              <w:right w:w="120" w:type="dxa"/>
+            </w:tcMar>
+          </w:tcPr>
+          <w:p>
+            <w:pPr>
+              <w:jc w:val="both"/>
+              <w:rPr>
+                <w:rFonts w:ascii="Times New Roman" w:hAnsi="Times New Roman" w:cs="Times New Roman"/>
+              </w:rPr>
+            </w:pPr>
+            <w:r>
+              <w:rPr>
+                <w:rFonts w:ascii="Times New Roman" w:hAnsi="Times New Roman" w:cs="Times New Roman"/>
+              </w:rPr>
+              <w:t>Responsibilities will be divided according to the agreed roles outlined in Section 3, while research decisions and final reviews remain shared.</w:t>
             </w:r>
           </w:p>
         </w:tc>
       </w:tr>
       <w:tr>
-        <w:tc>
-          <w:tcPr>
-            <w:tcW w:w="0" w:type="auto"/>
-            <w:hideMark/>
-          </w:tcPr>
-          <w:p>
-            <w:pPr>
-              <w:jc w:val="both"/>
-              <w:rPr>
-                <w:rFonts w:ascii="Times New Roman" w:eastAsia="Times New Roman" w:hAnsi="Times New Roman" w:cs="Times New Roman"/>
-                <w:kern w:val="0"/>
-                <w:lang w:eastAsia="en-GB"/>
-                <w14:ligatures w14:val="none"/>
-              </w:rPr>
-            </w:pPr>
-            <w:r>
-              <w:rPr>
-                <w:rFonts w:ascii="Times New Roman" w:eastAsia="Times New Roman" w:hAnsi="Times New Roman" w:cs="Times New Roman"/>
-                <w:kern w:val="0"/>
-                <w:lang w:eastAsia="en-GB"/>
-                <w14:ligatures w14:val="none"/>
-              </w:rPr>
-              <w:t>Dashboard development</w:t>
-            </w:r>
-          </w:p>
-        </w:tc>
-        <w:tc>
-          <w:tcPr>
-            <w:tcW w:w="0" w:type="auto"/>
-            <w:hideMark/>
-          </w:tcPr>
-          <w:p>
-            <w:pPr>
-              <w:jc w:val="both"/>
-              <w:rPr>
-                <w:rFonts w:ascii="Times New Roman" w:eastAsia="Times New Roman" w:hAnsi="Times New Roman" w:cs="Times New Roman"/>
-                <w:kern w:val="0"/>
-                <w:lang w:eastAsia="en-GB"/>
-                <w14:ligatures w14:val="none"/>
-              </w:rPr>
-            </w:pPr>
-            <w:r>
-              <w:rPr>
-                <w:rFonts w:ascii="Times New Roman" w:eastAsia="Times New Roman" w:hAnsi="Times New Roman" w:cs="Times New Roman"/>
-                <w:kern w:val="0"/>
-                <w:lang w:eastAsia="en-GB"/>
-                <w14:ligatures w14:val="none"/>
-              </w:rPr>
-              <w:t>As dashboard development is a new topic in the course, both students will learn and implement the concepts collaboratively. They will jointly develop visualizations, explore interactive features, troubleshoot issues, and test the dashboard to ensure accuracy and usability.</w:t>
-            </w:r>
-          </w:p>
-        </w:tc>
-      </w:tr>
-      <w:tr>
-        <w:tc>
-          <w:tcPr>
-            <w:tcW w:w="0" w:type="auto"/>
-            <w:hideMark/>
-          </w:tcPr>
-          <w:p>
-            <w:pPr>
-              <w:jc w:val="both"/>
-              <w:rPr>
-                <w:rFonts w:ascii="Times New Roman" w:eastAsia="Times New Roman" w:hAnsi="Times New Roman" w:cs="Times New Roman"/>
-                <w:kern w:val="0"/>
-                <w:lang w:eastAsia="en-GB"/>
-                <w14:ligatures w14:val="none"/>
-              </w:rPr>
-            </w:pPr>
-            <w:r>
-              <w:rPr>
-                <w:rFonts w:ascii="Times New Roman" w:eastAsia="Times New Roman" w:hAnsi="Times New Roman" w:cs="Times New Roman"/>
-                <w:kern w:val="0"/>
-                <w:lang w:eastAsia="en-GB"/>
-                <w14:ligatures w14:val="none"/>
-              </w:rPr>
-              <w:t>Project ideation and proposal</w:t>
-            </w:r>
-          </w:p>
-        </w:tc>
-        <w:tc>
-          <w:tcPr>
-            <w:tcW w:w="0" w:type="auto"/>
-            <w:hideMark/>
-          </w:tcPr>
-          <w:p>
-            <w:pPr>
-              <w:jc w:val="both"/>
-              <w:rPr>
-                <w:rFonts w:ascii="Times New Roman" w:eastAsia="Times New Roman" w:hAnsi="Times New Roman" w:cs="Times New Roman"/>
-                <w:kern w:val="0"/>
-                <w:lang w:eastAsia="en-GB"/>
-                <w14:ligatures w14:val="none"/>
-              </w:rPr>
-            </w:pPr>
-            <w:r>
-              <w:rPr>
-                <w:rFonts w:ascii="Times New Roman" w:eastAsia="Times New Roman" w:hAnsi="Times New Roman" w:cs="Times New Roman"/>
-                <w:kern w:val="0"/>
-                <w:lang w:eastAsia="en-GB"/>
-                <w14:ligatures w14:val="none"/>
-              </w:rPr>
-              <w:t>Responsibilities will be divided according to the agreed roles outlined in Section 3, while research decisions and final reviews remain shared.</w:t>
-            </w:r>
-          </w:p>
-        </w:tc>
-      </w:tr>
-      <w:tr>
-        <w:tc>
-          <w:tcPr>
-            <w:tcW w:w="0" w:type="auto"/>
-            <w:hideMark/>
-          </w:tcPr>
-          <w:p>
-            <w:pPr>
-              <w:jc w:val="both"/>
-              <w:rPr>
-                <w:rFonts w:ascii="Times New Roman" w:eastAsia="Times New Roman" w:hAnsi="Times New Roman" w:cs="Times New Roman"/>
-                <w:kern w:val="0"/>
-                <w:lang w:eastAsia="en-GB"/>
-                <w14:ligatures w14:val="none"/>
-              </w:rPr>
-            </w:pPr>
-            <w:r>
-              <w:rPr>
-                <w:rFonts w:ascii="Times New Roman" w:eastAsia="Times New Roman" w:hAnsi="Times New Roman" w:cs="Times New Roman"/>
-                <w:kern w:val="0"/>
-                <w:lang w:eastAsia="en-GB"/>
-                <w14:ligatures w14:val="none"/>
+        <w:tblPrEx>
+          <w:tblCellMar>
+            <w:top w:w="0" w:type="dxa"/>
+            <w:bottom w:w="0" w:type="dxa"/>
+          </w:tblCellMar>
+        </w:tblPrEx>
+        <w:tc>
+          <w:tcPr>
+            <w:tcW w:w="2400" w:type="dxa"/>
+            <w:tcBorders>
+              <w:top w:val="single" w:sz="4" w:space="0" w:color="999999"/>
+              <w:left w:val="single" w:sz="4" w:space="0" w:color="999999"/>
+              <w:bottom w:val="single" w:sz="4" w:space="0" w:color="999999"/>
+              <w:right w:val="single" w:sz="4" w:space="0" w:color="999999"/>
+            </w:tcBorders>
+            <w:tcMar>
+              <w:top w:w="80" w:type="dxa"/>
+              <w:left w:w="120" w:type="dxa"/>
+              <w:bottom w:w="80" w:type="dxa"/>
+              <w:right w:w="120" w:type="dxa"/>
+            </w:tcMar>
+          </w:tcPr>
+          <w:p>
+            <w:pPr>
+              <w:jc w:val="both"/>
+              <w:rPr>
+                <w:rFonts w:ascii="Times New Roman" w:hAnsi="Times New Roman" w:cs="Times New Roman"/>
+              </w:rPr>
+            </w:pPr>
+            <w:r>
+              <w:rPr>
+                <w:rFonts w:ascii="Times New Roman" w:hAnsi="Times New Roman" w:cs="Times New Roman"/>
+                <w:b/>
+                <w:bCs/>
               </w:rPr>
               <w:t>GitHub workflow</w:t>
             </w:r>
@@ -434,25 +491,30 @@
         </w:tc>
         <w:tc>
           <w:tcPr>
-            <w:tcW w:w="0" w:type="auto"/>
-            <w:hideMark/>
-          </w:tcPr>
-          <w:p>
-            <w:pPr>
-              <w:jc w:val="both"/>
-              <w:rPr>
-                <w:rFonts w:ascii="Times New Roman" w:eastAsia="Times New Roman" w:hAnsi="Times New Roman" w:cs="Times New Roman"/>
-                <w:kern w:val="0"/>
-                <w:lang w:eastAsia="en-GB"/>
-                <w14:ligatures w14:val="none"/>
-              </w:rPr>
-            </w:pPr>
-            <w:r>
-              <w:rPr>
-                <w:rFonts w:ascii="Times New Roman" w:eastAsia="Times New Roman" w:hAnsi="Times New Roman" w:cs="Times New Roman"/>
-                <w:kern w:val="0"/>
-                <w:lang w:eastAsia="en-GB"/>
-                <w14:ligatures w14:val="none"/>
+            <w:tcW w:w="6626" w:type="dxa"/>
+            <w:tcBorders>
+              <w:top w:val="single" w:sz="4" w:space="0" w:color="999999"/>
+              <w:left w:val="single" w:sz="4" w:space="0" w:color="999999"/>
+              <w:bottom w:val="single" w:sz="4" w:space="0" w:color="999999"/>
+              <w:right w:val="single" w:sz="4" w:space="0" w:color="999999"/>
+            </w:tcBorders>
+            <w:tcMar>
+              <w:top w:w="80" w:type="dxa"/>
+              <w:left w:w="120" w:type="dxa"/>
+              <w:bottom w:w="80" w:type="dxa"/>
+              <w:right w:w="120" w:type="dxa"/>
+            </w:tcMar>
+          </w:tcPr>
+          <w:p>
+            <w:pPr>
+              <w:jc w:val="both"/>
+              <w:rPr>
+                <w:rFonts w:ascii="Times New Roman" w:hAnsi="Times New Roman" w:cs="Times New Roman"/>
+              </w:rPr>
+            </w:pPr>
+            <w:r>
+              <w:rPr>
+                <w:rFonts w:ascii="Times New Roman" w:hAnsi="Times New Roman" w:cs="Times New Roman"/>
               </w:rPr>
               <w:t>GitHub will be used to manage shared code, track changes, maintain consistent versions, and facilitate review and integration of contributions.</w:t>
             </w:r>
@@ -462,254 +524,301 @@
     </w:tbl>
     <w:p>
       <w:pPr>
-        <w:spacing w:before="100" w:beforeAutospacing="1" w:after="100" w:afterAutospacing="1" w:line="240" w:lineRule="auto"/>
-        <w:jc w:val="both"/>
-        <w:outlineLvl w:val="1"/>
+        <w:pStyle w:val="Heading1"/>
         <w:rPr>
-          <w:rFonts w:ascii="Times New Roman" w:eastAsia="Times New Roman" w:hAnsi="Times New Roman" w:cs="Times New Roman"/>
-          <w:b/>
-          <w:bCs/>
-          <w:kern w:val="0"/>
-          <w:lang w:eastAsia="en-GB"/>
-          <w14:ligatures w14:val="none"/>
+          <w:rFonts w:ascii="Times New Roman" w:hAnsi="Times New Roman" w:cs="Times New Roman"/>
+          <w:sz w:val="32"/>
+          <w:szCs w:val="32"/>
         </w:rPr>
       </w:pPr>
       <w:r>
         <w:rPr>
-          <w:rFonts w:ascii="Times New Roman" w:eastAsia="Times New Roman" w:hAnsi="Times New Roman" w:cs="Times New Roman"/>
-          <w:b/>
-          <w:bCs/>
-          <w:kern w:val="0"/>
-          <w:lang w:eastAsia="en-GB"/>
-          <w14:ligatures w14:val="none"/>
+          <w:rFonts w:ascii="Times New Roman" w:hAnsi="Times New Roman" w:cs="Times New Roman"/>
+          <w:sz w:val="32"/>
+          <w:szCs w:val="32"/>
         </w:rPr>
-        <w:t xml:space="preserve">Division of Responsibilities – Project </w:t>
-      </w:r>
-      <w:r>
-        <w:rPr>
-          <w:rFonts w:ascii="Times New Roman" w:eastAsia="Times New Roman" w:hAnsi="Times New Roman" w:cs="Times New Roman"/>
-          <w:b/>
-          <w:bCs/>
-          <w:kern w:val="0"/>
-          <w:lang w:eastAsia="en-GB"/>
-          <w14:ligatures w14:val="none"/>
-        </w:rPr>
-        <w:t xml:space="preserve">Ideation and </w:t>
-      </w:r>
-      <w:r>
-        <w:rPr>
-          <w:rFonts w:ascii="Times New Roman" w:eastAsia="Times New Roman" w:hAnsi="Times New Roman" w:cs="Times New Roman"/>
-          <w:b/>
-          <w:bCs/>
-          <w:kern w:val="0"/>
-          <w:lang w:eastAsia="en-GB"/>
-          <w14:ligatures w14:val="none"/>
-        </w:rPr>
-        <w:t>Proposal</w:t>
+        <w:t>Division of Responsibilities – Project Ideation and Proposal</w:t>
       </w:r>
     </w:p>
     <w:tbl>
       <w:tblPr>
-        <w:tblStyle w:val="TableGrid"/>
-        <w:tblW w:w="0" w:type="auto"/>
-        <w:tblLook w:val="04A0" w:firstRow="1" w:lastRow="0" w:firstColumn="1" w:lastColumn="0" w:noHBand="0" w:noVBand="1"/>
+        <w:tblW w:w="9026" w:type="dxa"/>
+        <w:tblBorders>
+          <w:top w:val="single" w:sz="4" w:space="0" w:color="auto"/>
+          <w:left w:val="single" w:sz="4" w:space="0" w:color="auto"/>
+          <w:bottom w:val="single" w:sz="4" w:space="0" w:color="auto"/>
+          <w:right w:val="single" w:sz="4" w:space="0" w:color="auto"/>
+          <w:insideH w:val="single" w:sz="4" w:space="0" w:color="auto"/>
+          <w:insideV w:val="single" w:sz="4" w:space="0" w:color="auto"/>
+        </w:tblBorders>
+        <w:tblCellMar>
+          <w:left w:w="10" w:type="dxa"/>
+          <w:right w:w="10" w:type="dxa"/>
+        </w:tblCellMar>
+        <w:tblLook w:val="0000" w:firstRow="0" w:lastRow="0" w:firstColumn="0" w:lastColumn="0" w:noHBand="0" w:noVBand="0"/>
       </w:tblPr>
       <w:tblGrid>
-        <w:gridCol w:w="1333"/>
-        <w:gridCol w:w="7683"/>
+        <w:gridCol w:w="2000"/>
+        <w:gridCol w:w="7026"/>
       </w:tblGrid>
       <w:tr>
-        <w:tc>
-          <w:tcPr>
-            <w:tcW w:w="0" w:type="auto"/>
-            <w:hideMark/>
-          </w:tcPr>
-          <w:p>
-            <w:pPr>
-              <w:jc w:val="both"/>
-              <w:rPr>
-                <w:rFonts w:ascii="Times New Roman" w:eastAsia="Times New Roman" w:hAnsi="Times New Roman" w:cs="Times New Roman"/>
+        <w:tblPrEx>
+          <w:tblCellMar>
+            <w:top w:w="0" w:type="dxa"/>
+            <w:bottom w:w="0" w:type="dxa"/>
+          </w:tblCellMar>
+        </w:tblPrEx>
+        <w:trPr>
+          <w:tblHeader/>
+        </w:trPr>
+        <w:tc>
+          <w:tcPr>
+            <w:tcW w:w="2000" w:type="dxa"/>
+            <w:tcBorders>
+              <w:top w:val="single" w:sz="4" w:space="0" w:color="999999"/>
+              <w:left w:val="single" w:sz="4" w:space="0" w:color="999999"/>
+              <w:bottom w:val="single" w:sz="4" w:space="0" w:color="999999"/>
+              <w:right w:val="single" w:sz="4" w:space="0" w:color="999999"/>
+            </w:tcBorders>
+            <w:shd w:val="clear" w:color="auto" w:fill="D9E2F3"/>
+            <w:tcMar>
+              <w:top w:w="80" w:type="dxa"/>
+              <w:left w:w="120" w:type="dxa"/>
+              <w:bottom w:w="80" w:type="dxa"/>
+              <w:right w:w="120" w:type="dxa"/>
+            </w:tcMar>
+          </w:tcPr>
+          <w:p>
+            <w:pPr>
+              <w:jc w:val="both"/>
+              <w:rPr>
+                <w:rFonts w:ascii="Times New Roman" w:hAnsi="Times New Roman" w:cs="Times New Roman"/>
+              </w:rPr>
+            </w:pPr>
+            <w:r>
+              <w:rPr>
+                <w:rFonts w:ascii="Times New Roman" w:hAnsi="Times New Roman" w:cs="Times New Roman"/>
                 <w:b/>
                 <w:bCs/>
-                <w:kern w:val="0"/>
-                <w:lang w:eastAsia="en-GB"/>
-                <w14:ligatures w14:val="none"/>
-              </w:rPr>
-            </w:pPr>
-            <w:r>
-              <w:rPr>
-                <w:rFonts w:ascii="Times New Roman" w:eastAsia="Times New Roman" w:hAnsi="Times New Roman" w:cs="Times New Roman"/>
+              </w:rPr>
+              <w:t>Member</w:t>
+            </w:r>
+          </w:p>
+        </w:tc>
+        <w:tc>
+          <w:tcPr>
+            <w:tcW w:w="7026" w:type="dxa"/>
+            <w:tcBorders>
+              <w:top w:val="single" w:sz="4" w:space="0" w:color="999999"/>
+              <w:left w:val="single" w:sz="4" w:space="0" w:color="999999"/>
+              <w:bottom w:val="single" w:sz="4" w:space="0" w:color="999999"/>
+              <w:right w:val="single" w:sz="4" w:space="0" w:color="999999"/>
+            </w:tcBorders>
+            <w:shd w:val="clear" w:color="auto" w:fill="D9E2F3"/>
+            <w:tcMar>
+              <w:top w:w="80" w:type="dxa"/>
+              <w:left w:w="120" w:type="dxa"/>
+              <w:bottom w:w="80" w:type="dxa"/>
+              <w:right w:w="120" w:type="dxa"/>
+            </w:tcMar>
+          </w:tcPr>
+          <w:p>
+            <w:pPr>
+              <w:jc w:val="both"/>
+              <w:rPr>
+                <w:rFonts w:ascii="Times New Roman" w:hAnsi="Times New Roman" w:cs="Times New Roman"/>
+              </w:rPr>
+            </w:pPr>
+            <w:r>
+              <w:rPr>
+                <w:rFonts w:ascii="Times New Roman" w:hAnsi="Times New Roman" w:cs="Times New Roman"/>
                 <w:b/>
                 <w:bCs/>
-                <w:kern w:val="0"/>
-                <w:lang w:eastAsia="en-GB"/>
-                <w14:ligatures w14:val="none"/>
-              </w:rPr>
-              <w:t>Member</w:t>
-            </w:r>
-          </w:p>
-        </w:tc>
-        <w:tc>
-          <w:tcPr>
-            <w:tcW w:w="0" w:type="auto"/>
-            <w:hideMark/>
-          </w:tcPr>
-          <w:p>
-            <w:pPr>
-              <w:jc w:val="both"/>
-              <w:rPr>
-                <w:rFonts w:ascii="Times New Roman" w:eastAsia="Times New Roman" w:hAnsi="Times New Roman" w:cs="Times New Roman"/>
+              </w:rPr>
+              <w:t>Primary responsibilities</w:t>
+            </w:r>
+          </w:p>
+        </w:tc>
+      </w:tr>
+      <w:tr>
+        <w:tblPrEx>
+          <w:tblCellMar>
+            <w:top w:w="0" w:type="dxa"/>
+            <w:bottom w:w="0" w:type="dxa"/>
+          </w:tblCellMar>
+        </w:tblPrEx>
+        <w:tc>
+          <w:tcPr>
+            <w:tcW w:w="2000" w:type="dxa"/>
+            <w:tcBorders>
+              <w:top w:val="single" w:sz="4" w:space="0" w:color="999999"/>
+              <w:left w:val="single" w:sz="4" w:space="0" w:color="999999"/>
+              <w:bottom w:val="single" w:sz="4" w:space="0" w:color="999999"/>
+              <w:right w:val="single" w:sz="4" w:space="0" w:color="999999"/>
+            </w:tcBorders>
+            <w:tcMar>
+              <w:top w:w="80" w:type="dxa"/>
+              <w:left w:w="120" w:type="dxa"/>
+              <w:bottom w:w="80" w:type="dxa"/>
+              <w:right w:w="120" w:type="dxa"/>
+            </w:tcMar>
+          </w:tcPr>
+          <w:p>
+            <w:pPr>
+              <w:jc w:val="both"/>
+              <w:rPr>
+                <w:rFonts w:ascii="Times New Roman" w:hAnsi="Times New Roman" w:cs="Times New Roman"/>
+              </w:rPr>
+            </w:pPr>
+            <w:r>
+              <w:rPr>
+                <w:rFonts w:ascii="Times New Roman" w:hAnsi="Times New Roman" w:cs="Times New Roman"/>
                 <w:b/>
                 <w:bCs/>
-                <w:kern w:val="0"/>
-                <w:lang w:eastAsia="en-GB"/>
-                <w14:ligatures w14:val="none"/>
-              </w:rPr>
-            </w:pPr>
-            <w:r>
-              <w:rPr>
-                <w:rFonts w:ascii="Times New Roman" w:eastAsia="Times New Roman" w:hAnsi="Times New Roman" w:cs="Times New Roman"/>
+              </w:rPr>
+              <w:t>Student A</w:t>
+            </w:r>
+          </w:p>
+        </w:tc>
+        <w:tc>
+          <w:tcPr>
+            <w:tcW w:w="7026" w:type="dxa"/>
+            <w:tcBorders>
+              <w:top w:val="single" w:sz="4" w:space="0" w:color="999999"/>
+              <w:left w:val="single" w:sz="4" w:space="0" w:color="999999"/>
+              <w:bottom w:val="single" w:sz="4" w:space="0" w:color="999999"/>
+              <w:right w:val="single" w:sz="4" w:space="0" w:color="999999"/>
+            </w:tcBorders>
+            <w:tcMar>
+              <w:top w:w="80" w:type="dxa"/>
+              <w:left w:w="120" w:type="dxa"/>
+              <w:bottom w:w="80" w:type="dxa"/>
+              <w:right w:w="120" w:type="dxa"/>
+            </w:tcMar>
+          </w:tcPr>
+          <w:p>
+            <w:pPr>
+              <w:jc w:val="both"/>
+              <w:rPr>
+                <w:rFonts w:ascii="Times New Roman" w:hAnsi="Times New Roman" w:cs="Times New Roman"/>
+              </w:rPr>
+            </w:pPr>
+            <w:r>
+              <w:rPr>
+                <w:rFonts w:ascii="Times New Roman" w:hAnsi="Times New Roman" w:cs="Times New Roman"/>
+              </w:rPr>
+              <w:t>Data acquisition and cleaning, statistical analysis and testing, Python/Jupyter Notebook development, and reproducibility checks.</w:t>
+            </w:r>
+          </w:p>
+        </w:tc>
+      </w:tr>
+      <w:tr>
+        <w:tblPrEx>
+          <w:tblCellMar>
+            <w:top w:w="0" w:type="dxa"/>
+            <w:bottom w:w="0" w:type="dxa"/>
+          </w:tblCellMar>
+        </w:tblPrEx>
+        <w:tc>
+          <w:tcPr>
+            <w:tcW w:w="2000" w:type="dxa"/>
+            <w:tcBorders>
+              <w:top w:val="single" w:sz="4" w:space="0" w:color="999999"/>
+              <w:left w:val="single" w:sz="4" w:space="0" w:color="999999"/>
+              <w:bottom w:val="single" w:sz="4" w:space="0" w:color="999999"/>
+              <w:right w:val="single" w:sz="4" w:space="0" w:color="999999"/>
+            </w:tcBorders>
+            <w:tcMar>
+              <w:top w:w="80" w:type="dxa"/>
+              <w:left w:w="120" w:type="dxa"/>
+              <w:bottom w:w="80" w:type="dxa"/>
+              <w:right w:w="120" w:type="dxa"/>
+            </w:tcMar>
+          </w:tcPr>
+          <w:p>
+            <w:pPr>
+              <w:jc w:val="both"/>
+              <w:rPr>
+                <w:rFonts w:ascii="Times New Roman" w:hAnsi="Times New Roman" w:cs="Times New Roman"/>
+              </w:rPr>
+            </w:pPr>
+            <w:r>
+              <w:rPr>
+                <w:rFonts w:ascii="Times New Roman" w:hAnsi="Times New Roman" w:cs="Times New Roman"/>
                 <w:b/>
                 <w:bCs/>
-                <w:kern w:val="0"/>
-                <w:lang w:eastAsia="en-GB"/>
-                <w14:ligatures w14:val="none"/>
-              </w:rPr>
-              <w:t>Primary responsibilities</w:t>
+              </w:rPr>
+              <w:t>Student B</w:t>
+            </w:r>
+          </w:p>
+        </w:tc>
+        <w:tc>
+          <w:tcPr>
+            <w:tcW w:w="7026" w:type="dxa"/>
+            <w:tcBorders>
+              <w:top w:val="single" w:sz="4" w:space="0" w:color="999999"/>
+              <w:left w:val="single" w:sz="4" w:space="0" w:color="999999"/>
+              <w:bottom w:val="single" w:sz="4" w:space="0" w:color="999999"/>
+              <w:right w:val="single" w:sz="4" w:space="0" w:color="999999"/>
+            </w:tcBorders>
+            <w:tcMar>
+              <w:top w:w="80" w:type="dxa"/>
+              <w:left w:w="120" w:type="dxa"/>
+              <w:bottom w:w="80" w:type="dxa"/>
+              <w:right w:w="120" w:type="dxa"/>
+            </w:tcMar>
+          </w:tcPr>
+          <w:p>
+            <w:pPr>
+              <w:jc w:val="both"/>
+              <w:rPr>
+                <w:rFonts w:ascii="Times New Roman" w:hAnsi="Times New Roman" w:cs="Times New Roman"/>
+              </w:rPr>
+            </w:pPr>
+            <w:r>
+              <w:rPr>
+                <w:rFonts w:ascii="Times New Roman" w:hAnsi="Times New Roman" w:cs="Times New Roman"/>
+              </w:rPr>
+              <w:t>Visualization design, figure captions, dashboard presentation and interactivity, and written proposal and justification.</w:t>
             </w:r>
           </w:p>
         </w:tc>
       </w:tr>
       <w:tr>
-        <w:tc>
-          <w:tcPr>
-            <w:tcW w:w="0" w:type="auto"/>
-            <w:hideMark/>
-          </w:tcPr>
-          <w:p>
-            <w:pPr>
-              <w:jc w:val="both"/>
-              <w:rPr>
-                <w:rFonts w:ascii="Times New Roman" w:eastAsia="Times New Roman" w:hAnsi="Times New Roman" w:cs="Times New Roman"/>
-                <w:kern w:val="0"/>
-                <w:lang w:eastAsia="en-GB"/>
-                <w14:ligatures w14:val="none"/>
-              </w:rPr>
-            </w:pPr>
-            <w:r>
-              <w:rPr>
-                <w:rFonts w:ascii="Times New Roman" w:eastAsia="Times New Roman" w:hAnsi="Times New Roman" w:cs="Times New Roman"/>
-                <w:kern w:val="0"/>
-                <w:lang w:eastAsia="en-GB"/>
-                <w14:ligatures w14:val="none"/>
-              </w:rPr>
-              <w:t>Student A</w:t>
-            </w:r>
-          </w:p>
-        </w:tc>
-        <w:tc>
-          <w:tcPr>
-            <w:tcW w:w="0" w:type="auto"/>
-            <w:hideMark/>
-          </w:tcPr>
-          <w:p>
-            <w:pPr>
-              <w:jc w:val="both"/>
-              <w:rPr>
-                <w:rFonts w:ascii="Times New Roman" w:eastAsia="Times New Roman" w:hAnsi="Times New Roman" w:cs="Times New Roman"/>
-                <w:kern w:val="0"/>
-                <w:lang w:eastAsia="en-GB"/>
-                <w14:ligatures w14:val="none"/>
-              </w:rPr>
-            </w:pPr>
-            <w:r>
-              <w:rPr>
-                <w:rFonts w:ascii="Times New Roman" w:eastAsia="Times New Roman" w:hAnsi="Times New Roman" w:cs="Times New Roman"/>
-                <w:kern w:val="0"/>
-                <w:lang w:eastAsia="en-GB"/>
-                <w14:ligatures w14:val="none"/>
-              </w:rPr>
-              <w:t>Data acquisition and cleaning, statistical analysis and testing, Python/Jupyter Notebook development, and reproducibility checks.</w:t>
-            </w:r>
-          </w:p>
-        </w:tc>
-      </w:tr>
-      <w:tr>
-        <w:tc>
-          <w:tcPr>
-            <w:tcW w:w="0" w:type="auto"/>
-            <w:hideMark/>
-          </w:tcPr>
-          <w:p>
-            <w:pPr>
-              <w:jc w:val="both"/>
-              <w:rPr>
-                <w:rFonts w:ascii="Times New Roman" w:eastAsia="Times New Roman" w:hAnsi="Times New Roman" w:cs="Times New Roman"/>
-                <w:kern w:val="0"/>
-                <w:lang w:eastAsia="en-GB"/>
-                <w14:ligatures w14:val="none"/>
-              </w:rPr>
-            </w:pPr>
-            <w:r>
-              <w:rPr>
-                <w:rFonts w:ascii="Times New Roman" w:eastAsia="Times New Roman" w:hAnsi="Times New Roman" w:cs="Times New Roman"/>
-                <w:kern w:val="0"/>
-                <w:lang w:eastAsia="en-GB"/>
-                <w14:ligatures w14:val="none"/>
-              </w:rPr>
-              <w:t>Student B</w:t>
-            </w:r>
-          </w:p>
-        </w:tc>
-        <w:tc>
-          <w:tcPr>
-            <w:tcW w:w="0" w:type="auto"/>
-            <w:hideMark/>
-          </w:tcPr>
-          <w:p>
-            <w:pPr>
-              <w:jc w:val="both"/>
-              <w:rPr>
-                <w:rFonts w:ascii="Times New Roman" w:eastAsia="Times New Roman" w:hAnsi="Times New Roman" w:cs="Times New Roman"/>
-                <w:kern w:val="0"/>
-                <w:lang w:eastAsia="en-GB"/>
-                <w14:ligatures w14:val="none"/>
-              </w:rPr>
-            </w:pPr>
-            <w:r>
-              <w:rPr>
-                <w:rFonts w:ascii="Times New Roman" w:eastAsia="Times New Roman" w:hAnsi="Times New Roman" w:cs="Times New Roman"/>
-                <w:kern w:val="0"/>
-                <w:lang w:eastAsia="en-GB"/>
-                <w14:ligatures w14:val="none"/>
-              </w:rPr>
-              <w:t>Visualization design, figure captions, dashboard presentation and interactivity, and written proposal and justification.</w:t>
-            </w:r>
-          </w:p>
-        </w:tc>
-      </w:tr>
-      <w:tr>
-        <w:tc>
-          <w:tcPr>
-            <w:tcW w:w="0" w:type="auto"/>
-            <w:hideMark/>
-          </w:tcPr>
-          <w:p>
-            <w:pPr>
-              <w:jc w:val="both"/>
-              <w:rPr>
-                <w:rFonts w:ascii="Times New Roman" w:eastAsia="Times New Roman" w:hAnsi="Times New Roman" w:cs="Times New Roman"/>
-                <w:kern w:val="0"/>
-                <w:lang w:eastAsia="en-GB"/>
-                <w14:ligatures w14:val="none"/>
-              </w:rPr>
-            </w:pPr>
-            <w:r>
-              <w:rPr>
-                <w:rFonts w:ascii="Times New Roman" w:eastAsia="Times New Roman" w:hAnsi="Times New Roman" w:cs="Times New Roman"/>
-                <w:kern w:val="0"/>
-                <w:lang w:eastAsia="en-GB"/>
-                <w14:ligatures w14:val="none"/>
+        <w:tblPrEx>
+          <w:tblCellMar>
+            <w:top w:w="0" w:type="dxa"/>
+            <w:bottom w:w="0" w:type="dxa"/>
+          </w:tblCellMar>
+        </w:tblPrEx>
+        <w:tc>
+          <w:tcPr>
+            <w:tcW w:w="2000" w:type="dxa"/>
+            <w:tcBorders>
+              <w:top w:val="single" w:sz="4" w:space="0" w:color="999999"/>
+              <w:left w:val="single" w:sz="4" w:space="0" w:color="999999"/>
+              <w:bottom w:val="single" w:sz="4" w:space="0" w:color="999999"/>
+              <w:right w:val="single" w:sz="4" w:space="0" w:color="999999"/>
+            </w:tcBorders>
+            <w:tcMar>
+              <w:top w:w="80" w:type="dxa"/>
+              <w:left w:w="120" w:type="dxa"/>
+              <w:bottom w:w="80" w:type="dxa"/>
+              <w:right w:w="120" w:type="dxa"/>
+            </w:tcMar>
+          </w:tcPr>
+          <w:p>
+            <w:pPr>
+              <w:jc w:val="both"/>
+              <w:rPr>
+                <w:rFonts w:ascii="Times New Roman" w:hAnsi="Times New Roman" w:cs="Times New Roman"/>
+              </w:rPr>
+            </w:pPr>
+            <w:r>
+              <w:rPr>
+                <w:rFonts w:ascii="Times New Roman" w:hAnsi="Times New Roman" w:cs="Times New Roman"/>
+                <w:b/>
+                <w:bCs/>
               </w:rPr>
               <w:t>Both students</w:t>
             </w:r>
@@ -717,25 +826,30 @@
         </w:tc>
         <w:tc>
           <w:tcPr>
-            <w:tcW w:w="0" w:type="auto"/>
-            <w:hideMark/>
-          </w:tcPr>
-          <w:p>
-            <w:pPr>
-              <w:jc w:val="both"/>
-              <w:rPr>
-                <w:rFonts w:ascii="Times New Roman" w:eastAsia="Times New Roman" w:hAnsi="Times New Roman" w:cs="Times New Roman"/>
-                <w:kern w:val="0"/>
-                <w:lang w:eastAsia="en-GB"/>
-                <w14:ligatures w14:val="none"/>
-              </w:rPr>
-            </w:pPr>
-            <w:r>
-              <w:rPr>
-                <w:rFonts w:ascii="Times New Roman" w:eastAsia="Times New Roman" w:hAnsi="Times New Roman" w:cs="Times New Roman"/>
-                <w:kern w:val="0"/>
-                <w:lang w:eastAsia="en-GB"/>
-                <w14:ligatures w14:val="none"/>
+            <w:tcW w:w="7026" w:type="dxa"/>
+            <w:tcBorders>
+              <w:top w:val="single" w:sz="4" w:space="0" w:color="999999"/>
+              <w:left w:val="single" w:sz="4" w:space="0" w:color="999999"/>
+              <w:bottom w:val="single" w:sz="4" w:space="0" w:color="999999"/>
+              <w:right w:val="single" w:sz="4" w:space="0" w:color="999999"/>
+            </w:tcBorders>
+            <w:tcMar>
+              <w:top w:w="80" w:type="dxa"/>
+              <w:left w:w="120" w:type="dxa"/>
+              <w:bottom w:w="80" w:type="dxa"/>
+              <w:right w:w="120" w:type="dxa"/>
+            </w:tcMar>
+          </w:tcPr>
+          <w:p>
+            <w:pPr>
+              <w:jc w:val="both"/>
+              <w:rPr>
+                <w:rFonts w:ascii="Times New Roman" w:hAnsi="Times New Roman" w:cs="Times New Roman"/>
+              </w:rPr>
+            </w:pPr>
+            <w:r>
+              <w:rPr>
+                <w:rFonts w:ascii="Times New Roman" w:hAnsi="Times New Roman" w:cs="Times New Roman"/>
               </w:rPr>
               <w:t>Define the research question, agree on methodology, review each other's contributions, and approve the final deliverables.</w:t>
             </w:r>
@@ -745,159 +859,2560 @@
     </w:tbl>
     <w:p>
       <w:pPr>
-        <w:spacing w:before="100" w:beforeAutospacing="1" w:after="100" w:afterAutospacing="1" w:line="240" w:lineRule="auto"/>
-        <w:jc w:val="both"/>
-        <w:outlineLvl w:val="1"/>
+        <w:pStyle w:val="Heading1"/>
         <w:rPr>
-          <w:rFonts w:ascii="Times New Roman" w:eastAsia="Times New Roman" w:hAnsi="Times New Roman" w:cs="Times New Roman"/>
-          <w:b/>
-          <w:bCs/>
-          <w:kern w:val="0"/>
-          <w:lang w:eastAsia="en-GB"/>
-          <w14:ligatures w14:val="none"/>
+          <w:rFonts w:ascii="Times New Roman" w:hAnsi="Times New Roman" w:cs="Times New Roman"/>
+          <w:sz w:val="32"/>
+          <w:szCs w:val="32"/>
         </w:rPr>
       </w:pPr>
       <w:r>
         <w:rPr>
-          <w:rFonts w:ascii="Times New Roman" w:eastAsia="Times New Roman" w:hAnsi="Times New Roman" w:cs="Times New Roman"/>
-          <w:b/>
-          <w:bCs/>
-          <w:kern w:val="0"/>
-          <w:lang w:eastAsia="en-GB"/>
-          <w14:ligatures w14:val="none"/>
+          <w:rFonts w:ascii="Times New Roman" w:hAnsi="Times New Roman" w:cs="Times New Roman"/>
+          <w:sz w:val="32"/>
+          <w:szCs w:val="32"/>
         </w:rPr>
+        <w:lastRenderedPageBreak/>
+        <w:t>Team Members</w:t>
+      </w:r>
+    </w:p>
+    <w:tbl>
+      <w:tblPr>
+        <w:tblW w:w="9026" w:type="dxa"/>
+        <w:tblBorders>
+          <w:top w:val="single" w:sz="4" w:space="0" w:color="auto"/>
+          <w:left w:val="single" w:sz="4" w:space="0" w:color="auto"/>
+          <w:bottom w:val="single" w:sz="4" w:space="0" w:color="auto"/>
+          <w:right w:val="single" w:sz="4" w:space="0" w:color="auto"/>
+          <w:insideH w:val="single" w:sz="4" w:space="0" w:color="auto"/>
+          <w:insideV w:val="single" w:sz="4" w:space="0" w:color="auto"/>
+        </w:tblBorders>
+        <w:tblCellMar>
+          <w:left w:w="10" w:type="dxa"/>
+          <w:right w:w="10" w:type="dxa"/>
+        </w:tblCellMar>
+        <w:tblLook w:val="0000" w:firstRow="0" w:lastRow="0" w:firstColumn="0" w:lastColumn="0" w:noHBand="0" w:noVBand="0"/>
+      </w:tblPr>
+      <w:tblGrid>
+        <w:gridCol w:w="2400"/>
+        <w:gridCol w:w="3313"/>
+        <w:gridCol w:w="3313"/>
+      </w:tblGrid>
+      <w:tr>
+        <w:tblPrEx>
+          <w:tblCellMar>
+            <w:top w:w="0" w:type="dxa"/>
+            <w:bottom w:w="0" w:type="dxa"/>
+          </w:tblCellMar>
+        </w:tblPrEx>
+        <w:trPr>
+          <w:tblHeader/>
+        </w:trPr>
+        <w:tc>
+          <w:tcPr>
+            <w:tcW w:w="2400" w:type="dxa"/>
+            <w:tcBorders>
+              <w:top w:val="single" w:sz="4" w:space="0" w:color="999999"/>
+              <w:left w:val="single" w:sz="4" w:space="0" w:color="999999"/>
+              <w:bottom w:val="single" w:sz="4" w:space="0" w:color="999999"/>
+              <w:right w:val="single" w:sz="4" w:space="0" w:color="999999"/>
+            </w:tcBorders>
+            <w:shd w:val="clear" w:color="auto" w:fill="D9E2F3"/>
+            <w:tcMar>
+              <w:top w:w="80" w:type="dxa"/>
+              <w:left w:w="120" w:type="dxa"/>
+              <w:bottom w:w="80" w:type="dxa"/>
+              <w:right w:w="120" w:type="dxa"/>
+            </w:tcMar>
+          </w:tcPr>
+          <w:p>
+            <w:pPr>
+              <w:jc w:val="both"/>
+              <w:rPr>
+                <w:rFonts w:ascii="Times New Roman" w:hAnsi="Times New Roman" w:cs="Times New Roman"/>
+              </w:rPr>
+            </w:pPr>
+            <w:r>
+              <w:rPr>
+                <w:rFonts w:ascii="Times New Roman" w:hAnsi="Times New Roman" w:cs="Times New Roman"/>
+                <w:b/>
+                <w:bCs/>
+              </w:rPr>
+              <w:t>Role</w:t>
+            </w:r>
+          </w:p>
+        </w:tc>
+        <w:tc>
+          <w:tcPr>
+            <w:tcW w:w="3313" w:type="dxa"/>
+            <w:tcBorders>
+              <w:top w:val="single" w:sz="4" w:space="0" w:color="999999"/>
+              <w:left w:val="single" w:sz="4" w:space="0" w:color="999999"/>
+              <w:bottom w:val="single" w:sz="4" w:space="0" w:color="999999"/>
+              <w:right w:val="single" w:sz="4" w:space="0" w:color="999999"/>
+            </w:tcBorders>
+            <w:shd w:val="clear" w:color="auto" w:fill="D9E2F3"/>
+            <w:tcMar>
+              <w:top w:w="80" w:type="dxa"/>
+              <w:left w:w="120" w:type="dxa"/>
+              <w:bottom w:w="80" w:type="dxa"/>
+              <w:right w:w="120" w:type="dxa"/>
+            </w:tcMar>
+          </w:tcPr>
+          <w:p>
+            <w:pPr>
+              <w:jc w:val="both"/>
+              <w:rPr>
+                <w:rFonts w:ascii="Times New Roman" w:hAnsi="Times New Roman" w:cs="Times New Roman"/>
+              </w:rPr>
+            </w:pPr>
+            <w:r>
+              <w:rPr>
+                <w:rFonts w:ascii="Times New Roman" w:hAnsi="Times New Roman" w:cs="Times New Roman"/>
+                <w:b/>
+                <w:bCs/>
+              </w:rPr>
+              <w:t>Name</w:t>
+            </w:r>
+          </w:p>
+        </w:tc>
+        <w:tc>
+          <w:tcPr>
+            <w:tcW w:w="3313" w:type="dxa"/>
+            <w:tcBorders>
+              <w:top w:val="single" w:sz="4" w:space="0" w:color="999999"/>
+              <w:left w:val="single" w:sz="4" w:space="0" w:color="999999"/>
+              <w:bottom w:val="single" w:sz="4" w:space="0" w:color="999999"/>
+              <w:right w:val="single" w:sz="4" w:space="0" w:color="999999"/>
+            </w:tcBorders>
+            <w:shd w:val="clear" w:color="auto" w:fill="D9E2F3"/>
+            <w:tcMar>
+              <w:top w:w="80" w:type="dxa"/>
+              <w:left w:w="120" w:type="dxa"/>
+              <w:bottom w:w="80" w:type="dxa"/>
+              <w:right w:w="120" w:type="dxa"/>
+            </w:tcMar>
+          </w:tcPr>
+          <w:p>
+            <w:pPr>
+              <w:jc w:val="both"/>
+              <w:rPr>
+                <w:rFonts w:ascii="Times New Roman" w:hAnsi="Times New Roman" w:cs="Times New Roman"/>
+              </w:rPr>
+            </w:pPr>
+            <w:r>
+              <w:rPr>
+                <w:rFonts w:ascii="Times New Roman" w:hAnsi="Times New Roman" w:cs="Times New Roman"/>
+                <w:b/>
+                <w:bCs/>
+              </w:rPr>
+              <w:t>Student ID</w:t>
+            </w:r>
+          </w:p>
+        </w:tc>
+      </w:tr>
+      <w:tr>
+        <w:tblPrEx>
+          <w:tblCellMar>
+            <w:top w:w="0" w:type="dxa"/>
+            <w:bottom w:w="0" w:type="dxa"/>
+          </w:tblCellMar>
+        </w:tblPrEx>
+        <w:tc>
+          <w:tcPr>
+            <w:tcW w:w="2400" w:type="dxa"/>
+            <w:tcBorders>
+              <w:top w:val="single" w:sz="4" w:space="0" w:color="999999"/>
+              <w:left w:val="single" w:sz="4" w:space="0" w:color="999999"/>
+              <w:bottom w:val="single" w:sz="4" w:space="0" w:color="999999"/>
+              <w:right w:val="single" w:sz="4" w:space="0" w:color="999999"/>
+            </w:tcBorders>
+            <w:tcMar>
+              <w:top w:w="80" w:type="dxa"/>
+              <w:left w:w="120" w:type="dxa"/>
+              <w:bottom w:w="80" w:type="dxa"/>
+              <w:right w:w="120" w:type="dxa"/>
+            </w:tcMar>
+          </w:tcPr>
+          <w:p>
+            <w:pPr>
+              <w:jc w:val="both"/>
+              <w:rPr>
+                <w:rFonts w:ascii="Times New Roman" w:hAnsi="Times New Roman" w:cs="Times New Roman"/>
+              </w:rPr>
+            </w:pPr>
+            <w:r>
+              <w:rPr>
+                <w:rFonts w:ascii="Times New Roman" w:hAnsi="Times New Roman" w:cs="Times New Roman"/>
+                <w:b/>
+                <w:bCs/>
+              </w:rPr>
+              <w:t>Student A</w:t>
+            </w:r>
+          </w:p>
+        </w:tc>
+        <w:tc>
+          <w:tcPr>
+            <w:tcW w:w="3313" w:type="dxa"/>
+            <w:tcBorders>
+              <w:top w:val="single" w:sz="4" w:space="0" w:color="999999"/>
+              <w:left w:val="single" w:sz="4" w:space="0" w:color="999999"/>
+              <w:bottom w:val="single" w:sz="4" w:space="0" w:color="999999"/>
+              <w:right w:val="single" w:sz="4" w:space="0" w:color="999999"/>
+            </w:tcBorders>
+            <w:tcMar>
+              <w:top w:w="80" w:type="dxa"/>
+              <w:left w:w="120" w:type="dxa"/>
+              <w:bottom w:w="80" w:type="dxa"/>
+              <w:right w:w="120" w:type="dxa"/>
+            </w:tcMar>
+          </w:tcPr>
+          <w:p>
+            <w:pPr>
+              <w:jc w:val="both"/>
+              <w:rPr>
+                <w:rFonts w:ascii="Times New Roman" w:hAnsi="Times New Roman" w:cs="Times New Roman"/>
+              </w:rPr>
+            </w:pPr>
+            <w:r>
+              <w:rPr>
+                <w:rFonts w:ascii="Times New Roman" w:hAnsi="Times New Roman" w:cs="Times New Roman"/>
+              </w:rPr>
+              <w:t>Kelden Jamtsho</w:t>
+            </w:r>
+          </w:p>
+        </w:tc>
+        <w:tc>
+          <w:tcPr>
+            <w:tcW w:w="3313" w:type="dxa"/>
+            <w:tcBorders>
+              <w:top w:val="single" w:sz="4" w:space="0" w:color="999999"/>
+              <w:left w:val="single" w:sz="4" w:space="0" w:color="999999"/>
+              <w:bottom w:val="single" w:sz="4" w:space="0" w:color="999999"/>
+              <w:right w:val="single" w:sz="4" w:space="0" w:color="999999"/>
+            </w:tcBorders>
+            <w:tcMar>
+              <w:top w:w="80" w:type="dxa"/>
+              <w:left w:w="120" w:type="dxa"/>
+              <w:bottom w:w="80" w:type="dxa"/>
+              <w:right w:w="120" w:type="dxa"/>
+            </w:tcMar>
+          </w:tcPr>
+          <w:p>
+            <w:pPr>
+              <w:jc w:val="both"/>
+              <w:rPr>
+                <w:rFonts w:ascii="Times New Roman" w:hAnsi="Times New Roman" w:cs="Times New Roman"/>
+              </w:rPr>
+            </w:pPr>
+            <w:r>
+              <w:rPr>
+                <w:rFonts w:ascii="Times New Roman" w:hAnsi="Times New Roman" w:cs="Times New Roman"/>
+              </w:rPr>
+              <w:t>mc664183</w:t>
+            </w:r>
+          </w:p>
+        </w:tc>
+      </w:tr>
+      <w:tr>
+        <w:tblPrEx>
+          <w:tblCellMar>
+            <w:top w:w="0" w:type="dxa"/>
+            <w:bottom w:w="0" w:type="dxa"/>
+          </w:tblCellMar>
+        </w:tblPrEx>
+        <w:tc>
+          <w:tcPr>
+            <w:tcW w:w="2400" w:type="dxa"/>
+            <w:tcBorders>
+              <w:top w:val="single" w:sz="4" w:space="0" w:color="999999"/>
+              <w:left w:val="single" w:sz="4" w:space="0" w:color="999999"/>
+              <w:bottom w:val="single" w:sz="4" w:space="0" w:color="999999"/>
+              <w:right w:val="single" w:sz="4" w:space="0" w:color="999999"/>
+            </w:tcBorders>
+            <w:tcMar>
+              <w:top w:w="80" w:type="dxa"/>
+              <w:left w:w="120" w:type="dxa"/>
+              <w:bottom w:w="80" w:type="dxa"/>
+              <w:right w:w="120" w:type="dxa"/>
+            </w:tcMar>
+          </w:tcPr>
+          <w:p>
+            <w:pPr>
+              <w:jc w:val="both"/>
+              <w:rPr>
+                <w:rFonts w:ascii="Times New Roman" w:hAnsi="Times New Roman" w:cs="Times New Roman"/>
+              </w:rPr>
+            </w:pPr>
+            <w:r>
+              <w:rPr>
+                <w:rFonts w:ascii="Times New Roman" w:hAnsi="Times New Roman" w:cs="Times New Roman"/>
+                <w:b/>
+                <w:bCs/>
+              </w:rPr>
+              <w:t>Student B</w:t>
+            </w:r>
+          </w:p>
+        </w:tc>
+        <w:tc>
+          <w:tcPr>
+            <w:tcW w:w="3313" w:type="dxa"/>
+            <w:tcBorders>
+              <w:top w:val="single" w:sz="4" w:space="0" w:color="999999"/>
+              <w:left w:val="single" w:sz="4" w:space="0" w:color="999999"/>
+              <w:bottom w:val="single" w:sz="4" w:space="0" w:color="999999"/>
+              <w:right w:val="single" w:sz="4" w:space="0" w:color="999999"/>
+            </w:tcBorders>
+            <w:tcMar>
+              <w:top w:w="80" w:type="dxa"/>
+              <w:left w:w="120" w:type="dxa"/>
+              <w:bottom w:w="80" w:type="dxa"/>
+              <w:right w:w="120" w:type="dxa"/>
+            </w:tcMar>
+          </w:tcPr>
+          <w:p>
+            <w:pPr>
+              <w:jc w:val="both"/>
+              <w:rPr>
+                <w:rFonts w:ascii="Times New Roman" w:hAnsi="Times New Roman" w:cs="Times New Roman"/>
+              </w:rPr>
+            </w:pPr>
+            <w:r>
+              <w:rPr>
+                <w:rFonts w:ascii="Times New Roman" w:hAnsi="Times New Roman" w:cs="Times New Roman"/>
+              </w:rPr>
+              <w:t>UN CHI KIT</w:t>
+            </w:r>
+          </w:p>
+        </w:tc>
+        <w:tc>
+          <w:tcPr>
+            <w:tcW w:w="3313" w:type="dxa"/>
+            <w:tcBorders>
+              <w:top w:val="single" w:sz="4" w:space="0" w:color="999999"/>
+              <w:left w:val="single" w:sz="4" w:space="0" w:color="999999"/>
+              <w:bottom w:val="single" w:sz="4" w:space="0" w:color="999999"/>
+              <w:right w:val="single" w:sz="4" w:space="0" w:color="999999"/>
+            </w:tcBorders>
+            <w:tcMar>
+              <w:top w:w="80" w:type="dxa"/>
+              <w:left w:w="120" w:type="dxa"/>
+              <w:bottom w:w="80" w:type="dxa"/>
+              <w:right w:w="120" w:type="dxa"/>
+            </w:tcMar>
+          </w:tcPr>
+          <w:p>
+            <w:pPr>
+              <w:jc w:val="both"/>
+              <w:rPr>
+                <w:rFonts w:ascii="Times New Roman" w:hAnsi="Times New Roman" w:cs="Times New Roman"/>
+              </w:rPr>
+            </w:pPr>
+            <w:r>
+              <w:rPr>
+                <w:rFonts w:ascii="Times New Roman" w:hAnsi="Times New Roman" w:cs="Times New Roman"/>
+              </w:rPr>
+              <w:t>mc653081</w:t>
+            </w:r>
+          </w:p>
+        </w:tc>
+      </w:tr>
+    </w:tbl>
+    <w:p>
+      <w:pPr>
+        <w:pStyle w:val="Heading1"/>
+        <w:rPr>
+          <w:rFonts w:ascii="Times New Roman" w:hAnsi="Times New Roman" w:cs="Times New Roman"/>
+          <w:sz w:val="32"/>
+          <w:szCs w:val="32"/>
+        </w:rPr>
+      </w:pPr>
+      <w:r>
+        <w:rPr>
+          <w:rFonts w:ascii="Times New Roman" w:hAnsi="Times New Roman" w:cs="Times New Roman"/>
+          <w:sz w:val="32"/>
+          <w:szCs w:val="32"/>
+        </w:rPr>
+        <w:t>Agreed Technical Environment</w:t>
+      </w:r>
+    </w:p>
+    <w:p>
+      <w:pPr>
+        <w:spacing w:after="120"/>
+        <w:jc w:val="both"/>
+        <w:rPr>
+          <w:rFonts w:ascii="Times New Roman" w:hAnsi="Times New Roman" w:cs="Times New Roman"/>
+        </w:rPr>
+      </w:pPr>
+      <w:r>
+        <w:rPr>
+          <w:rFonts w:ascii="Times New Roman" w:hAnsi="Times New Roman" w:cs="Times New Roman"/>
+        </w:rPr>
+        <w:t>Both team members have agreed to use the same software versions for all laboratory exercises, the dashboard, and the project proposal, to ensure consistent and reproducible results.</w:t>
+      </w:r>
+    </w:p>
+    <w:tbl>
+      <w:tblPr>
+        <w:tblW w:w="9026" w:type="dxa"/>
+        <w:tblBorders>
+          <w:top w:val="single" w:sz="4" w:space="0" w:color="auto"/>
+          <w:left w:val="single" w:sz="4" w:space="0" w:color="auto"/>
+          <w:bottom w:val="single" w:sz="4" w:space="0" w:color="auto"/>
+          <w:right w:val="single" w:sz="4" w:space="0" w:color="auto"/>
+          <w:insideH w:val="single" w:sz="4" w:space="0" w:color="auto"/>
+          <w:insideV w:val="single" w:sz="4" w:space="0" w:color="auto"/>
+        </w:tblBorders>
+        <w:tblCellMar>
+          <w:left w:w="10" w:type="dxa"/>
+          <w:right w:w="10" w:type="dxa"/>
+        </w:tblCellMar>
+        <w:tblLook w:val="0000" w:firstRow="0" w:lastRow="0" w:firstColumn="0" w:lastColumn="0" w:noHBand="0" w:noVBand="0"/>
+      </w:tblPr>
+      <w:tblGrid>
+        <w:gridCol w:w="4513"/>
+        <w:gridCol w:w="4513"/>
+      </w:tblGrid>
+      <w:tr>
+        <w:tblPrEx>
+          <w:tblCellMar>
+            <w:top w:w="0" w:type="dxa"/>
+            <w:bottom w:w="0" w:type="dxa"/>
+          </w:tblCellMar>
+        </w:tblPrEx>
+        <w:trPr>
+          <w:tblHeader/>
+        </w:trPr>
+        <w:tc>
+          <w:tcPr>
+            <w:tcW w:w="4513" w:type="dxa"/>
+            <w:tcBorders>
+              <w:top w:val="single" w:sz="4" w:space="0" w:color="999999"/>
+              <w:left w:val="single" w:sz="4" w:space="0" w:color="999999"/>
+              <w:bottom w:val="single" w:sz="4" w:space="0" w:color="999999"/>
+              <w:right w:val="single" w:sz="4" w:space="0" w:color="999999"/>
+            </w:tcBorders>
+            <w:shd w:val="clear" w:color="auto" w:fill="D9E2F3"/>
+            <w:tcMar>
+              <w:top w:w="80" w:type="dxa"/>
+              <w:left w:w="120" w:type="dxa"/>
+              <w:bottom w:w="80" w:type="dxa"/>
+              <w:right w:w="120" w:type="dxa"/>
+            </w:tcMar>
+          </w:tcPr>
+          <w:p>
+            <w:pPr>
+              <w:jc w:val="both"/>
+              <w:rPr>
+                <w:rFonts w:ascii="Times New Roman" w:hAnsi="Times New Roman" w:cs="Times New Roman"/>
+              </w:rPr>
+            </w:pPr>
+            <w:r>
+              <w:rPr>
+                <w:rFonts w:ascii="Times New Roman" w:hAnsi="Times New Roman" w:cs="Times New Roman"/>
+                <w:b/>
+                <w:bCs/>
+              </w:rPr>
+              <w:t>Component</w:t>
+            </w:r>
+          </w:p>
+        </w:tc>
+        <w:tc>
+          <w:tcPr>
+            <w:tcW w:w="4513" w:type="dxa"/>
+            <w:tcBorders>
+              <w:top w:val="single" w:sz="4" w:space="0" w:color="999999"/>
+              <w:left w:val="single" w:sz="4" w:space="0" w:color="999999"/>
+              <w:bottom w:val="single" w:sz="4" w:space="0" w:color="999999"/>
+              <w:right w:val="single" w:sz="4" w:space="0" w:color="999999"/>
+            </w:tcBorders>
+            <w:shd w:val="clear" w:color="auto" w:fill="D9E2F3"/>
+            <w:tcMar>
+              <w:top w:w="80" w:type="dxa"/>
+              <w:left w:w="120" w:type="dxa"/>
+              <w:bottom w:w="80" w:type="dxa"/>
+              <w:right w:w="120" w:type="dxa"/>
+            </w:tcMar>
+          </w:tcPr>
+          <w:p>
+            <w:pPr>
+              <w:jc w:val="both"/>
+              <w:rPr>
+                <w:rFonts w:ascii="Times New Roman" w:hAnsi="Times New Roman" w:cs="Times New Roman"/>
+              </w:rPr>
+            </w:pPr>
+            <w:r>
+              <w:rPr>
+                <w:rFonts w:ascii="Times New Roman" w:hAnsi="Times New Roman" w:cs="Times New Roman"/>
+                <w:b/>
+                <w:bCs/>
+              </w:rPr>
+              <w:t>Agreed version</w:t>
+            </w:r>
+          </w:p>
+        </w:tc>
+      </w:tr>
+      <w:tr>
+        <w:tblPrEx>
+          <w:tblCellMar>
+            <w:top w:w="0" w:type="dxa"/>
+            <w:bottom w:w="0" w:type="dxa"/>
+          </w:tblCellMar>
+        </w:tblPrEx>
+        <w:tc>
+          <w:tcPr>
+            <w:tcW w:w="4513" w:type="dxa"/>
+            <w:tcBorders>
+              <w:top w:val="single" w:sz="4" w:space="0" w:color="999999"/>
+              <w:left w:val="single" w:sz="4" w:space="0" w:color="999999"/>
+              <w:bottom w:val="single" w:sz="4" w:space="0" w:color="999999"/>
+              <w:right w:val="single" w:sz="4" w:space="0" w:color="999999"/>
+            </w:tcBorders>
+            <w:tcMar>
+              <w:top w:w="80" w:type="dxa"/>
+              <w:left w:w="120" w:type="dxa"/>
+              <w:bottom w:w="80" w:type="dxa"/>
+              <w:right w:w="120" w:type="dxa"/>
+            </w:tcMar>
+          </w:tcPr>
+          <w:p>
+            <w:pPr>
+              <w:jc w:val="both"/>
+              <w:rPr>
+                <w:rFonts w:ascii="Times New Roman" w:hAnsi="Times New Roman" w:cs="Times New Roman"/>
+              </w:rPr>
+            </w:pPr>
+            <w:r>
+              <w:rPr>
+                <w:rFonts w:ascii="Times New Roman" w:hAnsi="Times New Roman" w:cs="Times New Roman"/>
+                <w:b/>
+                <w:bCs/>
+              </w:rPr>
+              <w:t>Python</w:t>
+            </w:r>
+          </w:p>
+        </w:tc>
+        <w:tc>
+          <w:tcPr>
+            <w:tcW w:w="4513" w:type="dxa"/>
+            <w:tcBorders>
+              <w:top w:val="single" w:sz="4" w:space="0" w:color="999999"/>
+              <w:left w:val="single" w:sz="4" w:space="0" w:color="999999"/>
+              <w:bottom w:val="single" w:sz="4" w:space="0" w:color="999999"/>
+              <w:right w:val="single" w:sz="4" w:space="0" w:color="999999"/>
+            </w:tcBorders>
+            <w:tcMar>
+              <w:top w:w="80" w:type="dxa"/>
+              <w:left w:w="120" w:type="dxa"/>
+              <w:bottom w:w="80" w:type="dxa"/>
+              <w:right w:w="120" w:type="dxa"/>
+            </w:tcMar>
+          </w:tcPr>
+          <w:p>
+            <w:pPr>
+              <w:jc w:val="both"/>
+              <w:rPr>
+                <w:rFonts w:ascii="Times New Roman" w:hAnsi="Times New Roman" w:cs="Times New Roman"/>
+              </w:rPr>
+            </w:pPr>
+            <w:r>
+              <w:rPr>
+                <w:rFonts w:ascii="Times New Roman" w:hAnsi="Times New Roman" w:cs="Times New Roman"/>
+              </w:rPr>
+              <w:t>3.13.5</w:t>
+            </w:r>
+          </w:p>
+        </w:tc>
+      </w:tr>
+      <w:tr>
+        <w:tblPrEx>
+          <w:tblCellMar>
+            <w:top w:w="0" w:type="dxa"/>
+            <w:bottom w:w="0" w:type="dxa"/>
+          </w:tblCellMar>
+        </w:tblPrEx>
+        <w:tc>
+          <w:tcPr>
+            <w:tcW w:w="4513" w:type="dxa"/>
+            <w:tcBorders>
+              <w:top w:val="single" w:sz="4" w:space="0" w:color="999999"/>
+              <w:left w:val="single" w:sz="4" w:space="0" w:color="999999"/>
+              <w:bottom w:val="single" w:sz="4" w:space="0" w:color="999999"/>
+              <w:right w:val="single" w:sz="4" w:space="0" w:color="999999"/>
+            </w:tcBorders>
+            <w:tcMar>
+              <w:top w:w="80" w:type="dxa"/>
+              <w:left w:w="120" w:type="dxa"/>
+              <w:bottom w:w="80" w:type="dxa"/>
+              <w:right w:w="120" w:type="dxa"/>
+            </w:tcMar>
+          </w:tcPr>
+          <w:p>
+            <w:pPr>
+              <w:jc w:val="both"/>
+              <w:rPr>
+                <w:rFonts w:ascii="Times New Roman" w:hAnsi="Times New Roman" w:cs="Times New Roman"/>
+              </w:rPr>
+            </w:pPr>
+            <w:r>
+              <w:rPr>
+                <w:rFonts w:ascii="Times New Roman" w:hAnsi="Times New Roman" w:cs="Times New Roman"/>
+                <w:b/>
+                <w:bCs/>
+              </w:rPr>
+              <w:t>pandas</w:t>
+            </w:r>
+          </w:p>
+        </w:tc>
+        <w:tc>
+          <w:tcPr>
+            <w:tcW w:w="4513" w:type="dxa"/>
+            <w:tcBorders>
+              <w:top w:val="single" w:sz="4" w:space="0" w:color="999999"/>
+              <w:left w:val="single" w:sz="4" w:space="0" w:color="999999"/>
+              <w:bottom w:val="single" w:sz="4" w:space="0" w:color="999999"/>
+              <w:right w:val="single" w:sz="4" w:space="0" w:color="999999"/>
+            </w:tcBorders>
+            <w:tcMar>
+              <w:top w:w="80" w:type="dxa"/>
+              <w:left w:w="120" w:type="dxa"/>
+              <w:bottom w:w="80" w:type="dxa"/>
+              <w:right w:w="120" w:type="dxa"/>
+            </w:tcMar>
+          </w:tcPr>
+          <w:p>
+            <w:pPr>
+              <w:jc w:val="both"/>
+              <w:rPr>
+                <w:rFonts w:ascii="Times New Roman" w:hAnsi="Times New Roman" w:cs="Times New Roman"/>
+              </w:rPr>
+            </w:pPr>
+            <w:r>
+              <w:rPr>
+                <w:rFonts w:ascii="Times New Roman" w:hAnsi="Times New Roman" w:cs="Times New Roman"/>
+              </w:rPr>
+              <w:t>2.3.2</w:t>
+            </w:r>
+          </w:p>
+        </w:tc>
+      </w:tr>
+      <w:tr>
+        <w:tblPrEx>
+          <w:tblCellMar>
+            <w:top w:w="0" w:type="dxa"/>
+            <w:bottom w:w="0" w:type="dxa"/>
+          </w:tblCellMar>
+        </w:tblPrEx>
+        <w:tc>
+          <w:tcPr>
+            <w:tcW w:w="4513" w:type="dxa"/>
+            <w:tcBorders>
+              <w:top w:val="single" w:sz="4" w:space="0" w:color="999999"/>
+              <w:left w:val="single" w:sz="4" w:space="0" w:color="999999"/>
+              <w:bottom w:val="single" w:sz="4" w:space="0" w:color="999999"/>
+              <w:right w:val="single" w:sz="4" w:space="0" w:color="999999"/>
+            </w:tcBorders>
+            <w:tcMar>
+              <w:top w:w="80" w:type="dxa"/>
+              <w:left w:w="120" w:type="dxa"/>
+              <w:bottom w:w="80" w:type="dxa"/>
+              <w:right w:w="120" w:type="dxa"/>
+            </w:tcMar>
+          </w:tcPr>
+          <w:p>
+            <w:pPr>
+              <w:jc w:val="both"/>
+              <w:rPr>
+                <w:rFonts w:ascii="Times New Roman" w:hAnsi="Times New Roman" w:cs="Times New Roman"/>
+              </w:rPr>
+            </w:pPr>
+            <w:r>
+              <w:rPr>
+                <w:rFonts w:ascii="Times New Roman" w:hAnsi="Times New Roman" w:cs="Times New Roman"/>
+                <w:b/>
+                <w:bCs/>
+              </w:rPr>
+              <w:t>NumPy</w:t>
+            </w:r>
+          </w:p>
+        </w:tc>
+        <w:tc>
+          <w:tcPr>
+            <w:tcW w:w="4513" w:type="dxa"/>
+            <w:tcBorders>
+              <w:top w:val="single" w:sz="4" w:space="0" w:color="999999"/>
+              <w:left w:val="single" w:sz="4" w:space="0" w:color="999999"/>
+              <w:bottom w:val="single" w:sz="4" w:space="0" w:color="999999"/>
+              <w:right w:val="single" w:sz="4" w:space="0" w:color="999999"/>
+            </w:tcBorders>
+            <w:tcMar>
+              <w:top w:w="80" w:type="dxa"/>
+              <w:left w:w="120" w:type="dxa"/>
+              <w:bottom w:w="80" w:type="dxa"/>
+              <w:right w:w="120" w:type="dxa"/>
+            </w:tcMar>
+          </w:tcPr>
+          <w:p>
+            <w:pPr>
+              <w:jc w:val="both"/>
+              <w:rPr>
+                <w:rFonts w:ascii="Times New Roman" w:hAnsi="Times New Roman" w:cs="Times New Roman"/>
+              </w:rPr>
+            </w:pPr>
+            <w:r>
+              <w:rPr>
+                <w:rFonts w:ascii="Times New Roman" w:hAnsi="Times New Roman" w:cs="Times New Roman"/>
+              </w:rPr>
+              <w:t>2.3.1</w:t>
+            </w:r>
+          </w:p>
+        </w:tc>
+      </w:tr>
+    </w:tbl>
+    <w:p>
+      <w:pPr>
+        <w:pStyle w:val="Heading1"/>
+        <w:rPr>
+          <w:rFonts w:ascii="Times New Roman" w:hAnsi="Times New Roman" w:cs="Times New Roman"/>
+          <w:sz w:val="32"/>
+          <w:szCs w:val="32"/>
+        </w:rPr>
+      </w:pPr>
+      <w:bookmarkStart w:id="0" w:name="_Laboratory_Exercise_Allocation"/>
+      <w:bookmarkEnd w:id="0"/>
+      <w:r>
+        <w:rPr>
+          <w:rFonts w:ascii="Times New Roman" w:hAnsi="Times New Roman" w:cs="Times New Roman"/>
+          <w:sz w:val="32"/>
+          <w:szCs w:val="32"/>
+        </w:rPr>
+        <w:t>Laboratory Exercise Allocation</w:t>
+      </w:r>
+    </w:p>
+    <w:p>
+      <w:pPr>
+        <w:spacing w:after="120"/>
+        <w:jc w:val="both"/>
+        <w:rPr>
+          <w:rFonts w:ascii="Times New Roman" w:hAnsi="Times New Roman" w:cs="Times New Roman"/>
+        </w:rPr>
+      </w:pPr>
+      <w:r>
+        <w:rPr>
+          <w:rFonts w:ascii="Times New Roman" w:hAnsi="Times New Roman" w:cs="Times New Roman"/>
+        </w:rPr>
+        <w:t>Laboratory exercises are allocated as follows (Kelden Jamtsho, Student A; UN CHI KIT, Student B). Each student will cross-check the other's work as described above.</w:t>
+      </w:r>
+    </w:p>
+    <w:tbl>
+      <w:tblPr>
+        <w:tblW w:w="9026" w:type="dxa"/>
+        <w:tblBorders>
+          <w:top w:val="single" w:sz="4" w:space="0" w:color="auto"/>
+          <w:left w:val="single" w:sz="4" w:space="0" w:color="auto"/>
+          <w:bottom w:val="single" w:sz="4" w:space="0" w:color="auto"/>
+          <w:right w:val="single" w:sz="4" w:space="0" w:color="auto"/>
+          <w:insideH w:val="single" w:sz="4" w:space="0" w:color="auto"/>
+          <w:insideV w:val="single" w:sz="4" w:space="0" w:color="auto"/>
+        </w:tblBorders>
+        <w:tblCellMar>
+          <w:left w:w="10" w:type="dxa"/>
+          <w:right w:w="10" w:type="dxa"/>
+        </w:tblCellMar>
+        <w:tblLook w:val="0000" w:firstRow="0" w:lastRow="0" w:firstColumn="0" w:lastColumn="0" w:noHBand="0" w:noVBand="0"/>
+      </w:tblPr>
+      <w:tblGrid>
+        <w:gridCol w:w="3600"/>
+        <w:gridCol w:w="1500"/>
+        <w:gridCol w:w="3926"/>
+      </w:tblGrid>
+      <w:tr>
+        <w:tblPrEx>
+          <w:tblCellMar>
+            <w:top w:w="0" w:type="dxa"/>
+            <w:bottom w:w="0" w:type="dxa"/>
+          </w:tblCellMar>
+        </w:tblPrEx>
+        <w:trPr>
+          <w:tblHeader/>
+        </w:trPr>
+        <w:tc>
+          <w:tcPr>
+            <w:tcW w:w="3600" w:type="dxa"/>
+            <w:tcBorders>
+              <w:top w:val="single" w:sz="4" w:space="0" w:color="999999"/>
+              <w:left w:val="single" w:sz="4" w:space="0" w:color="999999"/>
+              <w:bottom w:val="single" w:sz="4" w:space="0" w:color="999999"/>
+              <w:right w:val="single" w:sz="4" w:space="0" w:color="999999"/>
+            </w:tcBorders>
+            <w:shd w:val="clear" w:color="auto" w:fill="D9E2F3"/>
+            <w:tcMar>
+              <w:top w:w="80" w:type="dxa"/>
+              <w:left w:w="120" w:type="dxa"/>
+              <w:bottom w:w="80" w:type="dxa"/>
+              <w:right w:w="120" w:type="dxa"/>
+            </w:tcMar>
+          </w:tcPr>
+          <w:p>
+            <w:pPr>
+              <w:jc w:val="both"/>
+              <w:rPr>
+                <w:rFonts w:ascii="Times New Roman" w:hAnsi="Times New Roman" w:cs="Times New Roman"/>
+              </w:rPr>
+            </w:pPr>
+            <w:r>
+              <w:rPr>
+                <w:rFonts w:ascii="Times New Roman" w:hAnsi="Times New Roman" w:cs="Times New Roman"/>
+                <w:b/>
+                <w:bCs/>
+              </w:rPr>
+              <w:t>Module</w:t>
+            </w:r>
+          </w:p>
+        </w:tc>
+        <w:tc>
+          <w:tcPr>
+            <w:tcW w:w="1500" w:type="dxa"/>
+            <w:tcBorders>
+              <w:top w:val="single" w:sz="4" w:space="0" w:color="999999"/>
+              <w:left w:val="single" w:sz="4" w:space="0" w:color="999999"/>
+              <w:bottom w:val="single" w:sz="4" w:space="0" w:color="999999"/>
+              <w:right w:val="single" w:sz="4" w:space="0" w:color="999999"/>
+            </w:tcBorders>
+            <w:shd w:val="clear" w:color="auto" w:fill="D9E2F3"/>
+            <w:tcMar>
+              <w:top w:w="80" w:type="dxa"/>
+              <w:left w:w="120" w:type="dxa"/>
+              <w:bottom w:w="80" w:type="dxa"/>
+              <w:right w:w="120" w:type="dxa"/>
+            </w:tcMar>
+          </w:tcPr>
+          <w:p>
+            <w:pPr>
+              <w:jc w:val="both"/>
+              <w:rPr>
+                <w:rFonts w:ascii="Times New Roman" w:hAnsi="Times New Roman" w:cs="Times New Roman"/>
+              </w:rPr>
+            </w:pPr>
+            <w:r>
+              <w:rPr>
+                <w:rFonts w:ascii="Times New Roman" w:hAnsi="Times New Roman" w:cs="Times New Roman"/>
+                <w:b/>
+                <w:bCs/>
+              </w:rPr>
+              <w:t>Lab</w:t>
+            </w:r>
+          </w:p>
+        </w:tc>
+        <w:tc>
+          <w:tcPr>
+            <w:tcW w:w="3926" w:type="dxa"/>
+            <w:tcBorders>
+              <w:top w:val="single" w:sz="4" w:space="0" w:color="999999"/>
+              <w:left w:val="single" w:sz="4" w:space="0" w:color="999999"/>
+              <w:bottom w:val="single" w:sz="4" w:space="0" w:color="999999"/>
+              <w:right w:val="single" w:sz="4" w:space="0" w:color="999999"/>
+            </w:tcBorders>
+            <w:shd w:val="clear" w:color="auto" w:fill="D9E2F3"/>
+            <w:tcMar>
+              <w:top w:w="80" w:type="dxa"/>
+              <w:left w:w="120" w:type="dxa"/>
+              <w:bottom w:w="80" w:type="dxa"/>
+              <w:right w:w="120" w:type="dxa"/>
+            </w:tcMar>
+          </w:tcPr>
+          <w:p>
+            <w:pPr>
+              <w:jc w:val="both"/>
+              <w:rPr>
+                <w:rFonts w:ascii="Times New Roman" w:hAnsi="Times New Roman" w:cs="Times New Roman"/>
+              </w:rPr>
+            </w:pPr>
+            <w:r>
+              <w:rPr>
+                <w:rFonts w:ascii="Times New Roman" w:hAnsi="Times New Roman" w:cs="Times New Roman"/>
+                <w:b/>
+                <w:bCs/>
+              </w:rPr>
+              <w:t>Assigned to</w:t>
+            </w:r>
+          </w:p>
+        </w:tc>
+      </w:tr>
+      <w:tr>
+        <w:tblPrEx>
+          <w:tblCellMar>
+            <w:top w:w="0" w:type="dxa"/>
+            <w:bottom w:w="0" w:type="dxa"/>
+          </w:tblCellMar>
+        </w:tblPrEx>
+        <w:tc>
+          <w:tcPr>
+            <w:tcW w:w="3600" w:type="dxa"/>
+            <w:tcBorders>
+              <w:top w:val="single" w:sz="4" w:space="0" w:color="999999"/>
+              <w:left w:val="single" w:sz="4" w:space="0" w:color="999999"/>
+              <w:bottom w:val="single" w:sz="4" w:space="0" w:color="999999"/>
+              <w:right w:val="single" w:sz="4" w:space="0" w:color="999999"/>
+            </w:tcBorders>
+            <w:tcMar>
+              <w:top w:w="80" w:type="dxa"/>
+              <w:left w:w="120" w:type="dxa"/>
+              <w:bottom w:w="80" w:type="dxa"/>
+              <w:right w:w="120" w:type="dxa"/>
+            </w:tcMar>
+          </w:tcPr>
+          <w:p>
+            <w:pPr>
+              <w:jc w:val="both"/>
+              <w:rPr>
+                <w:rFonts w:ascii="Times New Roman" w:hAnsi="Times New Roman" w:cs="Times New Roman"/>
+              </w:rPr>
+            </w:pPr>
+            <w:r>
+              <w:rPr>
+                <w:rFonts w:ascii="Times New Roman" w:hAnsi="Times New Roman" w:cs="Times New Roman"/>
+                <w:b/>
+                <w:bCs/>
+              </w:rPr>
+              <w:t>Module 01</w:t>
+            </w:r>
+          </w:p>
+        </w:tc>
+        <w:tc>
+          <w:tcPr>
+            <w:tcW w:w="1500" w:type="dxa"/>
+            <w:tcBorders>
+              <w:top w:val="single" w:sz="4" w:space="0" w:color="999999"/>
+              <w:left w:val="single" w:sz="4" w:space="0" w:color="999999"/>
+              <w:bottom w:val="single" w:sz="4" w:space="0" w:color="999999"/>
+              <w:right w:val="single" w:sz="4" w:space="0" w:color="999999"/>
+            </w:tcBorders>
+            <w:tcMar>
+              <w:top w:w="80" w:type="dxa"/>
+              <w:left w:w="120" w:type="dxa"/>
+              <w:bottom w:w="80" w:type="dxa"/>
+              <w:right w:w="120" w:type="dxa"/>
+            </w:tcMar>
+          </w:tcPr>
+          <w:p>
+            <w:pPr>
+              <w:jc w:val="both"/>
+              <w:rPr>
+                <w:rFonts w:ascii="Times New Roman" w:hAnsi="Times New Roman" w:cs="Times New Roman"/>
+              </w:rPr>
+            </w:pPr>
+            <w:r>
+              <w:rPr>
+                <w:rFonts w:ascii="Times New Roman" w:hAnsi="Times New Roman" w:cs="Times New Roman"/>
+              </w:rPr>
+              <w:t>Lab01</w:t>
+            </w:r>
+          </w:p>
+        </w:tc>
+        <w:tc>
+          <w:tcPr>
+            <w:tcW w:w="3926" w:type="dxa"/>
+            <w:tcBorders>
+              <w:top w:val="single" w:sz="4" w:space="0" w:color="999999"/>
+              <w:left w:val="single" w:sz="4" w:space="0" w:color="999999"/>
+              <w:bottom w:val="single" w:sz="4" w:space="0" w:color="999999"/>
+              <w:right w:val="single" w:sz="4" w:space="0" w:color="999999"/>
+            </w:tcBorders>
+            <w:tcMar>
+              <w:top w:w="80" w:type="dxa"/>
+              <w:left w:w="120" w:type="dxa"/>
+              <w:bottom w:w="80" w:type="dxa"/>
+              <w:right w:w="120" w:type="dxa"/>
+            </w:tcMar>
+          </w:tcPr>
+          <w:p>
+            <w:pPr>
+              <w:jc w:val="both"/>
+              <w:rPr>
+                <w:rFonts w:ascii="Times New Roman" w:hAnsi="Times New Roman" w:cs="Times New Roman"/>
+              </w:rPr>
+            </w:pPr>
+            <w:r>
+              <w:rPr>
+                <w:rFonts w:ascii="Times New Roman" w:hAnsi="Times New Roman" w:cs="Times New Roman"/>
+              </w:rPr>
+              <w:t>(Kelden Jamtsho)</w:t>
+            </w:r>
+          </w:p>
+        </w:tc>
+      </w:tr>
+      <w:tr>
+        <w:tblPrEx>
+          <w:tblCellMar>
+            <w:top w:w="0" w:type="dxa"/>
+            <w:bottom w:w="0" w:type="dxa"/>
+          </w:tblCellMar>
+        </w:tblPrEx>
+        <w:tc>
+          <w:tcPr>
+            <w:tcW w:w="3600" w:type="dxa"/>
+            <w:tcBorders>
+              <w:top w:val="single" w:sz="4" w:space="0" w:color="999999"/>
+              <w:left w:val="single" w:sz="4" w:space="0" w:color="999999"/>
+              <w:bottom w:val="single" w:sz="4" w:space="0" w:color="999999"/>
+              <w:right w:val="single" w:sz="4" w:space="0" w:color="999999"/>
+            </w:tcBorders>
+            <w:tcMar>
+              <w:top w:w="80" w:type="dxa"/>
+              <w:left w:w="120" w:type="dxa"/>
+              <w:bottom w:w="80" w:type="dxa"/>
+              <w:right w:w="120" w:type="dxa"/>
+            </w:tcMar>
+          </w:tcPr>
+          <w:p>
+            <w:pPr>
+              <w:jc w:val="both"/>
+              <w:rPr>
+                <w:rFonts w:ascii="Times New Roman" w:hAnsi="Times New Roman" w:cs="Times New Roman"/>
+              </w:rPr>
+            </w:pPr>
+            <w:r>
+              <w:rPr>
+                <w:rFonts w:ascii="Times New Roman" w:hAnsi="Times New Roman" w:cs="Times New Roman"/>
+                <w:b/>
+                <w:bCs/>
+              </w:rPr>
+              <w:t>Module 01</w:t>
+            </w:r>
+          </w:p>
+        </w:tc>
+        <w:tc>
+          <w:tcPr>
+            <w:tcW w:w="1500" w:type="dxa"/>
+            <w:tcBorders>
+              <w:top w:val="single" w:sz="4" w:space="0" w:color="999999"/>
+              <w:left w:val="single" w:sz="4" w:space="0" w:color="999999"/>
+              <w:bottom w:val="single" w:sz="4" w:space="0" w:color="999999"/>
+              <w:right w:val="single" w:sz="4" w:space="0" w:color="999999"/>
+            </w:tcBorders>
+            <w:tcMar>
+              <w:top w:w="80" w:type="dxa"/>
+              <w:left w:w="120" w:type="dxa"/>
+              <w:bottom w:w="80" w:type="dxa"/>
+              <w:right w:w="120" w:type="dxa"/>
+            </w:tcMar>
+          </w:tcPr>
+          <w:p>
+            <w:pPr>
+              <w:jc w:val="both"/>
+              <w:rPr>
+                <w:rFonts w:ascii="Times New Roman" w:hAnsi="Times New Roman" w:cs="Times New Roman"/>
+              </w:rPr>
+            </w:pPr>
+            <w:r>
+              <w:rPr>
+                <w:rFonts w:ascii="Times New Roman" w:hAnsi="Times New Roman" w:cs="Times New Roman"/>
+              </w:rPr>
+              <w:t>Lab02</w:t>
+            </w:r>
+          </w:p>
+        </w:tc>
+        <w:tc>
+          <w:tcPr>
+            <w:tcW w:w="3926" w:type="dxa"/>
+            <w:tcBorders>
+              <w:top w:val="single" w:sz="4" w:space="0" w:color="999999"/>
+              <w:left w:val="single" w:sz="4" w:space="0" w:color="999999"/>
+              <w:bottom w:val="single" w:sz="4" w:space="0" w:color="999999"/>
+              <w:right w:val="single" w:sz="4" w:space="0" w:color="999999"/>
+            </w:tcBorders>
+            <w:tcMar>
+              <w:top w:w="80" w:type="dxa"/>
+              <w:left w:w="120" w:type="dxa"/>
+              <w:bottom w:w="80" w:type="dxa"/>
+              <w:right w:w="120" w:type="dxa"/>
+            </w:tcMar>
+          </w:tcPr>
+          <w:p>
+            <w:pPr>
+              <w:jc w:val="both"/>
+              <w:rPr>
+                <w:rFonts w:ascii="Times New Roman" w:hAnsi="Times New Roman" w:cs="Times New Roman"/>
+              </w:rPr>
+            </w:pPr>
+            <w:r>
+              <w:rPr>
+                <w:rFonts w:ascii="Times New Roman" w:hAnsi="Times New Roman" w:cs="Times New Roman"/>
+              </w:rPr>
+              <w:t>(UN CHI KIT)</w:t>
+            </w:r>
+          </w:p>
+        </w:tc>
+      </w:tr>
+      <w:tr>
+        <w:tblPrEx>
+          <w:tblCellMar>
+            <w:top w:w="0" w:type="dxa"/>
+            <w:bottom w:w="0" w:type="dxa"/>
+          </w:tblCellMar>
+        </w:tblPrEx>
+        <w:tc>
+          <w:tcPr>
+            <w:tcW w:w="3600" w:type="dxa"/>
+            <w:tcBorders>
+              <w:top w:val="single" w:sz="4" w:space="0" w:color="999999"/>
+              <w:left w:val="single" w:sz="4" w:space="0" w:color="999999"/>
+              <w:bottom w:val="single" w:sz="4" w:space="0" w:color="999999"/>
+              <w:right w:val="single" w:sz="4" w:space="0" w:color="999999"/>
+            </w:tcBorders>
+            <w:tcMar>
+              <w:top w:w="80" w:type="dxa"/>
+              <w:left w:w="120" w:type="dxa"/>
+              <w:bottom w:w="80" w:type="dxa"/>
+              <w:right w:w="120" w:type="dxa"/>
+            </w:tcMar>
+          </w:tcPr>
+          <w:p>
+            <w:pPr>
+              <w:jc w:val="both"/>
+              <w:rPr>
+                <w:rFonts w:ascii="Times New Roman" w:hAnsi="Times New Roman" w:cs="Times New Roman"/>
+              </w:rPr>
+            </w:pPr>
+            <w:r>
+              <w:rPr>
+                <w:rFonts w:ascii="Times New Roman" w:hAnsi="Times New Roman" w:cs="Times New Roman"/>
+                <w:b/>
+                <w:bCs/>
+              </w:rPr>
+              <w:t>Module 02</w:t>
+            </w:r>
+          </w:p>
+        </w:tc>
+        <w:tc>
+          <w:tcPr>
+            <w:tcW w:w="1500" w:type="dxa"/>
+            <w:tcBorders>
+              <w:top w:val="single" w:sz="4" w:space="0" w:color="999999"/>
+              <w:left w:val="single" w:sz="4" w:space="0" w:color="999999"/>
+              <w:bottom w:val="single" w:sz="4" w:space="0" w:color="999999"/>
+              <w:right w:val="single" w:sz="4" w:space="0" w:color="999999"/>
+            </w:tcBorders>
+            <w:tcMar>
+              <w:top w:w="80" w:type="dxa"/>
+              <w:left w:w="120" w:type="dxa"/>
+              <w:bottom w:w="80" w:type="dxa"/>
+              <w:right w:w="120" w:type="dxa"/>
+            </w:tcMar>
+          </w:tcPr>
+          <w:p>
+            <w:pPr>
+              <w:jc w:val="both"/>
+              <w:rPr>
+                <w:rFonts w:ascii="Times New Roman" w:hAnsi="Times New Roman" w:cs="Times New Roman"/>
+              </w:rPr>
+            </w:pPr>
+            <w:r>
+              <w:rPr>
+                <w:rFonts w:ascii="Times New Roman" w:hAnsi="Times New Roman" w:cs="Times New Roman"/>
+              </w:rPr>
+              <w:t>Lab01</w:t>
+            </w:r>
+          </w:p>
+        </w:tc>
+        <w:tc>
+          <w:tcPr>
+            <w:tcW w:w="3926" w:type="dxa"/>
+            <w:tcBorders>
+              <w:top w:val="single" w:sz="4" w:space="0" w:color="999999"/>
+              <w:left w:val="single" w:sz="4" w:space="0" w:color="999999"/>
+              <w:bottom w:val="single" w:sz="4" w:space="0" w:color="999999"/>
+              <w:right w:val="single" w:sz="4" w:space="0" w:color="999999"/>
+            </w:tcBorders>
+            <w:tcMar>
+              <w:top w:w="80" w:type="dxa"/>
+              <w:left w:w="120" w:type="dxa"/>
+              <w:bottom w:w="80" w:type="dxa"/>
+              <w:right w:w="120" w:type="dxa"/>
+            </w:tcMar>
+          </w:tcPr>
+          <w:p>
+            <w:pPr>
+              <w:jc w:val="both"/>
+              <w:rPr>
+                <w:rFonts w:ascii="Times New Roman" w:hAnsi="Times New Roman" w:cs="Times New Roman"/>
+              </w:rPr>
+            </w:pPr>
+            <w:r>
+              <w:rPr>
+                <w:rFonts w:ascii="Times New Roman" w:hAnsi="Times New Roman" w:cs="Times New Roman"/>
+              </w:rPr>
+              <w:t>(Kelden Jamtsho)</w:t>
+            </w:r>
+          </w:p>
+        </w:tc>
+      </w:tr>
+      <w:tr>
+        <w:tblPrEx>
+          <w:tblCellMar>
+            <w:top w:w="0" w:type="dxa"/>
+            <w:bottom w:w="0" w:type="dxa"/>
+          </w:tblCellMar>
+        </w:tblPrEx>
+        <w:tc>
+          <w:tcPr>
+            <w:tcW w:w="3600" w:type="dxa"/>
+            <w:tcBorders>
+              <w:top w:val="single" w:sz="4" w:space="0" w:color="999999"/>
+              <w:left w:val="single" w:sz="4" w:space="0" w:color="999999"/>
+              <w:bottom w:val="single" w:sz="4" w:space="0" w:color="999999"/>
+              <w:right w:val="single" w:sz="4" w:space="0" w:color="999999"/>
+            </w:tcBorders>
+            <w:tcMar>
+              <w:top w:w="80" w:type="dxa"/>
+              <w:left w:w="120" w:type="dxa"/>
+              <w:bottom w:w="80" w:type="dxa"/>
+              <w:right w:w="120" w:type="dxa"/>
+            </w:tcMar>
+          </w:tcPr>
+          <w:p>
+            <w:pPr>
+              <w:jc w:val="both"/>
+              <w:rPr>
+                <w:rFonts w:ascii="Times New Roman" w:hAnsi="Times New Roman" w:cs="Times New Roman"/>
+              </w:rPr>
+            </w:pPr>
+            <w:r>
+              <w:rPr>
+                <w:rFonts w:ascii="Times New Roman" w:hAnsi="Times New Roman" w:cs="Times New Roman"/>
+                <w:b/>
+                <w:bCs/>
+              </w:rPr>
+              <w:t>Module 02</w:t>
+            </w:r>
+          </w:p>
+        </w:tc>
+        <w:tc>
+          <w:tcPr>
+            <w:tcW w:w="1500" w:type="dxa"/>
+            <w:tcBorders>
+              <w:top w:val="single" w:sz="4" w:space="0" w:color="999999"/>
+              <w:left w:val="single" w:sz="4" w:space="0" w:color="999999"/>
+              <w:bottom w:val="single" w:sz="4" w:space="0" w:color="999999"/>
+              <w:right w:val="single" w:sz="4" w:space="0" w:color="999999"/>
+            </w:tcBorders>
+            <w:tcMar>
+              <w:top w:w="80" w:type="dxa"/>
+              <w:left w:w="120" w:type="dxa"/>
+              <w:bottom w:w="80" w:type="dxa"/>
+              <w:right w:w="120" w:type="dxa"/>
+            </w:tcMar>
+          </w:tcPr>
+          <w:p>
+            <w:pPr>
+              <w:jc w:val="both"/>
+              <w:rPr>
+                <w:rFonts w:ascii="Times New Roman" w:hAnsi="Times New Roman" w:cs="Times New Roman"/>
+              </w:rPr>
+            </w:pPr>
+            <w:r>
+              <w:rPr>
+                <w:rFonts w:ascii="Times New Roman" w:hAnsi="Times New Roman" w:cs="Times New Roman"/>
+              </w:rPr>
+              <w:t>Lab02</w:t>
+            </w:r>
+          </w:p>
+        </w:tc>
+        <w:tc>
+          <w:tcPr>
+            <w:tcW w:w="3926" w:type="dxa"/>
+            <w:tcBorders>
+              <w:top w:val="single" w:sz="4" w:space="0" w:color="999999"/>
+              <w:left w:val="single" w:sz="4" w:space="0" w:color="999999"/>
+              <w:bottom w:val="single" w:sz="4" w:space="0" w:color="999999"/>
+              <w:right w:val="single" w:sz="4" w:space="0" w:color="999999"/>
+            </w:tcBorders>
+            <w:tcMar>
+              <w:top w:w="80" w:type="dxa"/>
+              <w:left w:w="120" w:type="dxa"/>
+              <w:bottom w:w="80" w:type="dxa"/>
+              <w:right w:w="120" w:type="dxa"/>
+            </w:tcMar>
+          </w:tcPr>
+          <w:p>
+            <w:pPr>
+              <w:jc w:val="both"/>
+              <w:rPr>
+                <w:rFonts w:ascii="Times New Roman" w:hAnsi="Times New Roman" w:cs="Times New Roman"/>
+              </w:rPr>
+            </w:pPr>
+            <w:r>
+              <w:rPr>
+                <w:rFonts w:ascii="Times New Roman" w:hAnsi="Times New Roman" w:cs="Times New Roman"/>
+              </w:rPr>
+              <w:t>(UN CHI KIT)</w:t>
+            </w:r>
+          </w:p>
+        </w:tc>
+      </w:tr>
+      <w:tr>
+        <w:tblPrEx>
+          <w:tblCellMar>
+            <w:top w:w="0" w:type="dxa"/>
+            <w:bottom w:w="0" w:type="dxa"/>
+          </w:tblCellMar>
+        </w:tblPrEx>
+        <w:tc>
+          <w:tcPr>
+            <w:tcW w:w="3600" w:type="dxa"/>
+            <w:tcBorders>
+              <w:top w:val="single" w:sz="4" w:space="0" w:color="999999"/>
+              <w:left w:val="single" w:sz="4" w:space="0" w:color="999999"/>
+              <w:bottom w:val="single" w:sz="4" w:space="0" w:color="999999"/>
+              <w:right w:val="single" w:sz="4" w:space="0" w:color="999999"/>
+            </w:tcBorders>
+            <w:tcMar>
+              <w:top w:w="80" w:type="dxa"/>
+              <w:left w:w="120" w:type="dxa"/>
+              <w:bottom w:w="80" w:type="dxa"/>
+              <w:right w:w="120" w:type="dxa"/>
+            </w:tcMar>
+          </w:tcPr>
+          <w:p>
+            <w:pPr>
+              <w:jc w:val="both"/>
+              <w:rPr>
+                <w:rFonts w:ascii="Times New Roman" w:hAnsi="Times New Roman" w:cs="Times New Roman"/>
+              </w:rPr>
+            </w:pPr>
+            <w:r>
+              <w:rPr>
+                <w:rFonts w:ascii="Times New Roman" w:hAnsi="Times New Roman" w:cs="Times New Roman"/>
+                <w:b/>
+                <w:bCs/>
+              </w:rPr>
+              <w:t>Module 02</w:t>
+            </w:r>
+          </w:p>
+        </w:tc>
+        <w:tc>
+          <w:tcPr>
+            <w:tcW w:w="1500" w:type="dxa"/>
+            <w:tcBorders>
+              <w:top w:val="single" w:sz="4" w:space="0" w:color="999999"/>
+              <w:left w:val="single" w:sz="4" w:space="0" w:color="999999"/>
+              <w:bottom w:val="single" w:sz="4" w:space="0" w:color="999999"/>
+              <w:right w:val="single" w:sz="4" w:space="0" w:color="999999"/>
+            </w:tcBorders>
+            <w:tcMar>
+              <w:top w:w="80" w:type="dxa"/>
+              <w:left w:w="120" w:type="dxa"/>
+              <w:bottom w:w="80" w:type="dxa"/>
+              <w:right w:w="120" w:type="dxa"/>
+            </w:tcMar>
+          </w:tcPr>
+          <w:p>
+            <w:pPr>
+              <w:jc w:val="both"/>
+              <w:rPr>
+                <w:rFonts w:ascii="Times New Roman" w:hAnsi="Times New Roman" w:cs="Times New Roman"/>
+              </w:rPr>
+            </w:pPr>
+            <w:r>
+              <w:rPr>
+                <w:rFonts w:ascii="Times New Roman" w:hAnsi="Times New Roman" w:cs="Times New Roman"/>
+              </w:rPr>
+              <w:t>Lab03</w:t>
+            </w:r>
+          </w:p>
+        </w:tc>
+        <w:tc>
+          <w:tcPr>
+            <w:tcW w:w="3926" w:type="dxa"/>
+            <w:tcBorders>
+              <w:top w:val="single" w:sz="4" w:space="0" w:color="999999"/>
+              <w:left w:val="single" w:sz="4" w:space="0" w:color="999999"/>
+              <w:bottom w:val="single" w:sz="4" w:space="0" w:color="999999"/>
+              <w:right w:val="single" w:sz="4" w:space="0" w:color="999999"/>
+            </w:tcBorders>
+            <w:tcMar>
+              <w:top w:w="80" w:type="dxa"/>
+              <w:left w:w="120" w:type="dxa"/>
+              <w:bottom w:w="80" w:type="dxa"/>
+              <w:right w:w="120" w:type="dxa"/>
+            </w:tcMar>
+          </w:tcPr>
+          <w:p>
+            <w:pPr>
+              <w:jc w:val="both"/>
+              <w:rPr>
+                <w:rFonts w:ascii="Times New Roman" w:hAnsi="Times New Roman" w:cs="Times New Roman"/>
+              </w:rPr>
+            </w:pPr>
+            <w:r>
+              <w:rPr>
+                <w:rFonts w:ascii="Times New Roman" w:hAnsi="Times New Roman" w:cs="Times New Roman"/>
+              </w:rPr>
+              <w:t>(UN CHI KIT)</w:t>
+            </w:r>
+          </w:p>
+        </w:tc>
+      </w:tr>
+      <w:tr>
+        <w:tblPrEx>
+          <w:tblCellMar>
+            <w:top w:w="0" w:type="dxa"/>
+            <w:bottom w:w="0" w:type="dxa"/>
+          </w:tblCellMar>
+        </w:tblPrEx>
+        <w:tc>
+          <w:tcPr>
+            <w:tcW w:w="3600" w:type="dxa"/>
+            <w:tcBorders>
+              <w:top w:val="single" w:sz="4" w:space="0" w:color="999999"/>
+              <w:left w:val="single" w:sz="4" w:space="0" w:color="999999"/>
+              <w:bottom w:val="single" w:sz="4" w:space="0" w:color="999999"/>
+              <w:right w:val="single" w:sz="4" w:space="0" w:color="999999"/>
+            </w:tcBorders>
+            <w:tcMar>
+              <w:top w:w="80" w:type="dxa"/>
+              <w:left w:w="120" w:type="dxa"/>
+              <w:bottom w:w="80" w:type="dxa"/>
+              <w:right w:w="120" w:type="dxa"/>
+            </w:tcMar>
+          </w:tcPr>
+          <w:p>
+            <w:pPr>
+              <w:jc w:val="both"/>
+              <w:rPr>
+                <w:rFonts w:ascii="Times New Roman" w:hAnsi="Times New Roman" w:cs="Times New Roman"/>
+              </w:rPr>
+            </w:pPr>
+            <w:r>
+              <w:rPr>
+                <w:rFonts w:ascii="Times New Roman" w:hAnsi="Times New Roman" w:cs="Times New Roman"/>
+                <w:b/>
+                <w:bCs/>
+              </w:rPr>
+              <w:t>Module 03</w:t>
+            </w:r>
+          </w:p>
+        </w:tc>
+        <w:tc>
+          <w:tcPr>
+            <w:tcW w:w="1500" w:type="dxa"/>
+            <w:tcBorders>
+              <w:top w:val="single" w:sz="4" w:space="0" w:color="999999"/>
+              <w:left w:val="single" w:sz="4" w:space="0" w:color="999999"/>
+              <w:bottom w:val="single" w:sz="4" w:space="0" w:color="999999"/>
+              <w:right w:val="single" w:sz="4" w:space="0" w:color="999999"/>
+            </w:tcBorders>
+            <w:tcMar>
+              <w:top w:w="80" w:type="dxa"/>
+              <w:left w:w="120" w:type="dxa"/>
+              <w:bottom w:w="80" w:type="dxa"/>
+              <w:right w:w="120" w:type="dxa"/>
+            </w:tcMar>
+          </w:tcPr>
+          <w:p>
+            <w:pPr>
+              <w:jc w:val="both"/>
+              <w:rPr>
+                <w:rFonts w:ascii="Times New Roman" w:hAnsi="Times New Roman" w:cs="Times New Roman"/>
+              </w:rPr>
+            </w:pPr>
+            <w:r>
+              <w:rPr>
+                <w:rFonts w:ascii="Times New Roman" w:hAnsi="Times New Roman" w:cs="Times New Roman"/>
+              </w:rPr>
+              <w:t>Lab01</w:t>
+            </w:r>
+          </w:p>
+        </w:tc>
+        <w:tc>
+          <w:tcPr>
+            <w:tcW w:w="3926" w:type="dxa"/>
+            <w:tcBorders>
+              <w:top w:val="single" w:sz="4" w:space="0" w:color="999999"/>
+              <w:left w:val="single" w:sz="4" w:space="0" w:color="999999"/>
+              <w:bottom w:val="single" w:sz="4" w:space="0" w:color="999999"/>
+              <w:right w:val="single" w:sz="4" w:space="0" w:color="999999"/>
+            </w:tcBorders>
+            <w:tcMar>
+              <w:top w:w="80" w:type="dxa"/>
+              <w:left w:w="120" w:type="dxa"/>
+              <w:bottom w:w="80" w:type="dxa"/>
+              <w:right w:w="120" w:type="dxa"/>
+            </w:tcMar>
+          </w:tcPr>
+          <w:p>
+            <w:pPr>
+              <w:jc w:val="both"/>
+              <w:rPr>
+                <w:rFonts w:ascii="Times New Roman" w:hAnsi="Times New Roman" w:cs="Times New Roman"/>
+              </w:rPr>
+            </w:pPr>
+            <w:r>
+              <w:rPr>
+                <w:rFonts w:ascii="Times New Roman" w:hAnsi="Times New Roman" w:cs="Times New Roman"/>
+              </w:rPr>
+              <w:t>(Kelden Jamtsho)</w:t>
+            </w:r>
+          </w:p>
+        </w:tc>
+      </w:tr>
+      <w:tr>
+        <w:tblPrEx>
+          <w:tblCellMar>
+            <w:top w:w="0" w:type="dxa"/>
+            <w:bottom w:w="0" w:type="dxa"/>
+          </w:tblCellMar>
+        </w:tblPrEx>
+        <w:tc>
+          <w:tcPr>
+            <w:tcW w:w="3600" w:type="dxa"/>
+            <w:tcBorders>
+              <w:top w:val="single" w:sz="4" w:space="0" w:color="999999"/>
+              <w:left w:val="single" w:sz="4" w:space="0" w:color="999999"/>
+              <w:bottom w:val="single" w:sz="4" w:space="0" w:color="999999"/>
+              <w:right w:val="single" w:sz="4" w:space="0" w:color="999999"/>
+            </w:tcBorders>
+            <w:tcMar>
+              <w:top w:w="80" w:type="dxa"/>
+              <w:left w:w="120" w:type="dxa"/>
+              <w:bottom w:w="80" w:type="dxa"/>
+              <w:right w:w="120" w:type="dxa"/>
+            </w:tcMar>
+          </w:tcPr>
+          <w:p>
+            <w:pPr>
+              <w:jc w:val="both"/>
+              <w:rPr>
+                <w:rFonts w:ascii="Times New Roman" w:hAnsi="Times New Roman" w:cs="Times New Roman"/>
+              </w:rPr>
+            </w:pPr>
+            <w:r>
+              <w:rPr>
+                <w:rFonts w:ascii="Times New Roman" w:hAnsi="Times New Roman" w:cs="Times New Roman"/>
+                <w:b/>
+                <w:bCs/>
+              </w:rPr>
+              <w:t>Module 03</w:t>
+            </w:r>
+          </w:p>
+        </w:tc>
+        <w:tc>
+          <w:tcPr>
+            <w:tcW w:w="1500" w:type="dxa"/>
+            <w:tcBorders>
+              <w:top w:val="single" w:sz="4" w:space="0" w:color="999999"/>
+              <w:left w:val="single" w:sz="4" w:space="0" w:color="999999"/>
+              <w:bottom w:val="single" w:sz="4" w:space="0" w:color="999999"/>
+              <w:right w:val="single" w:sz="4" w:space="0" w:color="999999"/>
+            </w:tcBorders>
+            <w:tcMar>
+              <w:top w:w="80" w:type="dxa"/>
+              <w:left w:w="120" w:type="dxa"/>
+              <w:bottom w:w="80" w:type="dxa"/>
+              <w:right w:w="120" w:type="dxa"/>
+            </w:tcMar>
+          </w:tcPr>
+          <w:p>
+            <w:pPr>
+              <w:jc w:val="both"/>
+              <w:rPr>
+                <w:rFonts w:ascii="Times New Roman" w:hAnsi="Times New Roman" w:cs="Times New Roman"/>
+              </w:rPr>
+            </w:pPr>
+            <w:r>
+              <w:rPr>
+                <w:rFonts w:ascii="Times New Roman" w:hAnsi="Times New Roman" w:cs="Times New Roman"/>
+              </w:rPr>
+              <w:t>Lab02</w:t>
+            </w:r>
+          </w:p>
+        </w:tc>
+        <w:tc>
+          <w:tcPr>
+            <w:tcW w:w="3926" w:type="dxa"/>
+            <w:tcBorders>
+              <w:top w:val="single" w:sz="4" w:space="0" w:color="999999"/>
+              <w:left w:val="single" w:sz="4" w:space="0" w:color="999999"/>
+              <w:bottom w:val="single" w:sz="4" w:space="0" w:color="999999"/>
+              <w:right w:val="single" w:sz="4" w:space="0" w:color="999999"/>
+            </w:tcBorders>
+            <w:tcMar>
+              <w:top w:w="80" w:type="dxa"/>
+              <w:left w:w="120" w:type="dxa"/>
+              <w:bottom w:w="80" w:type="dxa"/>
+              <w:right w:w="120" w:type="dxa"/>
+            </w:tcMar>
+          </w:tcPr>
+          <w:p>
+            <w:pPr>
+              <w:jc w:val="both"/>
+              <w:rPr>
+                <w:rFonts w:ascii="Times New Roman" w:hAnsi="Times New Roman" w:cs="Times New Roman"/>
+              </w:rPr>
+            </w:pPr>
+            <w:r>
+              <w:rPr>
+                <w:rFonts w:ascii="Times New Roman" w:hAnsi="Times New Roman" w:cs="Times New Roman"/>
+              </w:rPr>
+              <w:t>(UN CHI KIT)</w:t>
+            </w:r>
+          </w:p>
+        </w:tc>
+      </w:tr>
+      <w:tr>
+        <w:tblPrEx>
+          <w:tblCellMar>
+            <w:top w:w="0" w:type="dxa"/>
+            <w:bottom w:w="0" w:type="dxa"/>
+          </w:tblCellMar>
+        </w:tblPrEx>
+        <w:tc>
+          <w:tcPr>
+            <w:tcW w:w="3600" w:type="dxa"/>
+            <w:tcBorders>
+              <w:top w:val="single" w:sz="4" w:space="0" w:color="999999"/>
+              <w:left w:val="single" w:sz="4" w:space="0" w:color="999999"/>
+              <w:bottom w:val="single" w:sz="4" w:space="0" w:color="999999"/>
+              <w:right w:val="single" w:sz="4" w:space="0" w:color="999999"/>
+            </w:tcBorders>
+            <w:tcMar>
+              <w:top w:w="80" w:type="dxa"/>
+              <w:left w:w="120" w:type="dxa"/>
+              <w:bottom w:w="80" w:type="dxa"/>
+              <w:right w:w="120" w:type="dxa"/>
+            </w:tcMar>
+          </w:tcPr>
+          <w:p>
+            <w:pPr>
+              <w:jc w:val="both"/>
+              <w:rPr>
+                <w:rFonts w:ascii="Times New Roman" w:hAnsi="Times New Roman" w:cs="Times New Roman"/>
+              </w:rPr>
+            </w:pPr>
+            <w:r>
+              <w:rPr>
+                <w:rFonts w:ascii="Times New Roman" w:hAnsi="Times New Roman" w:cs="Times New Roman"/>
+                <w:b/>
+                <w:bCs/>
+              </w:rPr>
+              <w:t>Module 04</w:t>
+            </w:r>
+          </w:p>
+        </w:tc>
+        <w:tc>
+          <w:tcPr>
+            <w:tcW w:w="1500" w:type="dxa"/>
+            <w:tcBorders>
+              <w:top w:val="single" w:sz="4" w:space="0" w:color="999999"/>
+              <w:left w:val="single" w:sz="4" w:space="0" w:color="999999"/>
+              <w:bottom w:val="single" w:sz="4" w:space="0" w:color="999999"/>
+              <w:right w:val="single" w:sz="4" w:space="0" w:color="999999"/>
+            </w:tcBorders>
+            <w:tcMar>
+              <w:top w:w="80" w:type="dxa"/>
+              <w:left w:w="120" w:type="dxa"/>
+              <w:bottom w:w="80" w:type="dxa"/>
+              <w:right w:w="120" w:type="dxa"/>
+            </w:tcMar>
+          </w:tcPr>
+          <w:p>
+            <w:pPr>
+              <w:jc w:val="both"/>
+              <w:rPr>
+                <w:rFonts w:ascii="Times New Roman" w:hAnsi="Times New Roman" w:cs="Times New Roman"/>
+              </w:rPr>
+            </w:pPr>
+            <w:r>
+              <w:rPr>
+                <w:rFonts w:ascii="Times New Roman" w:hAnsi="Times New Roman" w:cs="Times New Roman"/>
+              </w:rPr>
+              <w:t>Lab01</w:t>
+            </w:r>
+          </w:p>
+        </w:tc>
+        <w:tc>
+          <w:tcPr>
+            <w:tcW w:w="3926" w:type="dxa"/>
+            <w:tcBorders>
+              <w:top w:val="single" w:sz="4" w:space="0" w:color="999999"/>
+              <w:left w:val="single" w:sz="4" w:space="0" w:color="999999"/>
+              <w:bottom w:val="single" w:sz="4" w:space="0" w:color="999999"/>
+              <w:right w:val="single" w:sz="4" w:space="0" w:color="999999"/>
+            </w:tcBorders>
+            <w:tcMar>
+              <w:top w:w="80" w:type="dxa"/>
+              <w:left w:w="120" w:type="dxa"/>
+              <w:bottom w:w="80" w:type="dxa"/>
+              <w:right w:w="120" w:type="dxa"/>
+            </w:tcMar>
+          </w:tcPr>
+          <w:p>
+            <w:pPr>
+              <w:jc w:val="both"/>
+              <w:rPr>
+                <w:rFonts w:ascii="Times New Roman" w:hAnsi="Times New Roman" w:cs="Times New Roman"/>
+              </w:rPr>
+            </w:pPr>
+            <w:r>
+              <w:rPr>
+                <w:rFonts w:ascii="Times New Roman" w:hAnsi="Times New Roman" w:cs="Times New Roman"/>
+              </w:rPr>
+              <w:t>(UN CHI KIT)</w:t>
+            </w:r>
+          </w:p>
+        </w:tc>
+      </w:tr>
+      <w:tr>
+        <w:tblPrEx>
+          <w:tblCellMar>
+            <w:top w:w="0" w:type="dxa"/>
+            <w:bottom w:w="0" w:type="dxa"/>
+          </w:tblCellMar>
+        </w:tblPrEx>
+        <w:tc>
+          <w:tcPr>
+            <w:tcW w:w="3600" w:type="dxa"/>
+            <w:tcBorders>
+              <w:top w:val="single" w:sz="4" w:space="0" w:color="999999"/>
+              <w:left w:val="single" w:sz="4" w:space="0" w:color="999999"/>
+              <w:bottom w:val="single" w:sz="4" w:space="0" w:color="999999"/>
+              <w:right w:val="single" w:sz="4" w:space="0" w:color="999999"/>
+            </w:tcBorders>
+            <w:tcMar>
+              <w:top w:w="80" w:type="dxa"/>
+              <w:left w:w="120" w:type="dxa"/>
+              <w:bottom w:w="80" w:type="dxa"/>
+              <w:right w:w="120" w:type="dxa"/>
+            </w:tcMar>
+          </w:tcPr>
+          <w:p>
+            <w:pPr>
+              <w:jc w:val="both"/>
+              <w:rPr>
+                <w:rFonts w:ascii="Times New Roman" w:hAnsi="Times New Roman" w:cs="Times New Roman"/>
+              </w:rPr>
+            </w:pPr>
+            <w:r>
+              <w:rPr>
+                <w:rFonts w:ascii="Times New Roman" w:hAnsi="Times New Roman" w:cs="Times New Roman"/>
+                <w:b/>
+                <w:bCs/>
+              </w:rPr>
+              <w:t>Module 04</w:t>
+            </w:r>
+          </w:p>
+        </w:tc>
+        <w:tc>
+          <w:tcPr>
+            <w:tcW w:w="1500" w:type="dxa"/>
+            <w:tcBorders>
+              <w:top w:val="single" w:sz="4" w:space="0" w:color="999999"/>
+              <w:left w:val="single" w:sz="4" w:space="0" w:color="999999"/>
+              <w:bottom w:val="single" w:sz="4" w:space="0" w:color="999999"/>
+              <w:right w:val="single" w:sz="4" w:space="0" w:color="999999"/>
+            </w:tcBorders>
+            <w:tcMar>
+              <w:top w:w="80" w:type="dxa"/>
+              <w:left w:w="120" w:type="dxa"/>
+              <w:bottom w:w="80" w:type="dxa"/>
+              <w:right w:w="120" w:type="dxa"/>
+            </w:tcMar>
+          </w:tcPr>
+          <w:p>
+            <w:pPr>
+              <w:jc w:val="both"/>
+              <w:rPr>
+                <w:rFonts w:ascii="Times New Roman" w:hAnsi="Times New Roman" w:cs="Times New Roman"/>
+              </w:rPr>
+            </w:pPr>
+            <w:r>
+              <w:rPr>
+                <w:rFonts w:ascii="Times New Roman" w:hAnsi="Times New Roman" w:cs="Times New Roman"/>
+              </w:rPr>
+              <w:t>Lab02</w:t>
+            </w:r>
+          </w:p>
+        </w:tc>
+        <w:tc>
+          <w:tcPr>
+            <w:tcW w:w="3926" w:type="dxa"/>
+            <w:tcBorders>
+              <w:top w:val="single" w:sz="4" w:space="0" w:color="999999"/>
+              <w:left w:val="single" w:sz="4" w:space="0" w:color="999999"/>
+              <w:bottom w:val="single" w:sz="4" w:space="0" w:color="999999"/>
+              <w:right w:val="single" w:sz="4" w:space="0" w:color="999999"/>
+            </w:tcBorders>
+            <w:tcMar>
+              <w:top w:w="80" w:type="dxa"/>
+              <w:left w:w="120" w:type="dxa"/>
+              <w:bottom w:w="80" w:type="dxa"/>
+              <w:right w:w="120" w:type="dxa"/>
+            </w:tcMar>
+          </w:tcPr>
+          <w:p>
+            <w:pPr>
+              <w:jc w:val="both"/>
+              <w:rPr>
+                <w:rFonts w:ascii="Times New Roman" w:hAnsi="Times New Roman" w:cs="Times New Roman"/>
+              </w:rPr>
+            </w:pPr>
+            <w:r>
+              <w:rPr>
+                <w:rFonts w:ascii="Times New Roman" w:hAnsi="Times New Roman" w:cs="Times New Roman"/>
+              </w:rPr>
+              <w:t>(Kelden Jamtsho)</w:t>
+            </w:r>
+          </w:p>
+        </w:tc>
+      </w:tr>
+      <w:tr>
+        <w:tblPrEx>
+          <w:tblCellMar>
+            <w:top w:w="0" w:type="dxa"/>
+            <w:bottom w:w="0" w:type="dxa"/>
+          </w:tblCellMar>
+        </w:tblPrEx>
+        <w:tc>
+          <w:tcPr>
+            <w:tcW w:w="3600" w:type="dxa"/>
+            <w:tcBorders>
+              <w:top w:val="single" w:sz="4" w:space="0" w:color="999999"/>
+              <w:left w:val="single" w:sz="4" w:space="0" w:color="999999"/>
+              <w:bottom w:val="single" w:sz="4" w:space="0" w:color="999999"/>
+              <w:right w:val="single" w:sz="4" w:space="0" w:color="999999"/>
+            </w:tcBorders>
+            <w:tcMar>
+              <w:top w:w="80" w:type="dxa"/>
+              <w:left w:w="120" w:type="dxa"/>
+              <w:bottom w:w="80" w:type="dxa"/>
+              <w:right w:w="120" w:type="dxa"/>
+            </w:tcMar>
+          </w:tcPr>
+          <w:p>
+            <w:pPr>
+              <w:jc w:val="both"/>
+              <w:rPr>
+                <w:rFonts w:ascii="Times New Roman" w:hAnsi="Times New Roman" w:cs="Times New Roman"/>
+              </w:rPr>
+            </w:pPr>
+            <w:r>
+              <w:rPr>
+                <w:rFonts w:ascii="Times New Roman" w:hAnsi="Times New Roman" w:cs="Times New Roman"/>
+                <w:b/>
+                <w:bCs/>
+              </w:rPr>
+              <w:t>Module 04</w:t>
+            </w:r>
+          </w:p>
+        </w:tc>
+        <w:tc>
+          <w:tcPr>
+            <w:tcW w:w="1500" w:type="dxa"/>
+            <w:tcBorders>
+              <w:top w:val="single" w:sz="4" w:space="0" w:color="999999"/>
+              <w:left w:val="single" w:sz="4" w:space="0" w:color="999999"/>
+              <w:bottom w:val="single" w:sz="4" w:space="0" w:color="999999"/>
+              <w:right w:val="single" w:sz="4" w:space="0" w:color="999999"/>
+            </w:tcBorders>
+            <w:tcMar>
+              <w:top w:w="80" w:type="dxa"/>
+              <w:left w:w="120" w:type="dxa"/>
+              <w:bottom w:w="80" w:type="dxa"/>
+              <w:right w:w="120" w:type="dxa"/>
+            </w:tcMar>
+          </w:tcPr>
+          <w:p>
+            <w:pPr>
+              <w:jc w:val="both"/>
+              <w:rPr>
+                <w:rFonts w:ascii="Times New Roman" w:hAnsi="Times New Roman" w:cs="Times New Roman"/>
+              </w:rPr>
+            </w:pPr>
+            <w:r>
+              <w:rPr>
+                <w:rFonts w:ascii="Times New Roman" w:hAnsi="Times New Roman" w:cs="Times New Roman"/>
+              </w:rPr>
+              <w:t>Lab03</w:t>
+            </w:r>
+          </w:p>
+        </w:tc>
+        <w:tc>
+          <w:tcPr>
+            <w:tcW w:w="3926" w:type="dxa"/>
+            <w:tcBorders>
+              <w:top w:val="single" w:sz="4" w:space="0" w:color="999999"/>
+              <w:left w:val="single" w:sz="4" w:space="0" w:color="999999"/>
+              <w:bottom w:val="single" w:sz="4" w:space="0" w:color="999999"/>
+              <w:right w:val="single" w:sz="4" w:space="0" w:color="999999"/>
+            </w:tcBorders>
+            <w:tcMar>
+              <w:top w:w="80" w:type="dxa"/>
+              <w:left w:w="120" w:type="dxa"/>
+              <w:bottom w:w="80" w:type="dxa"/>
+              <w:right w:w="120" w:type="dxa"/>
+            </w:tcMar>
+          </w:tcPr>
+          <w:p>
+            <w:pPr>
+              <w:jc w:val="both"/>
+              <w:rPr>
+                <w:rFonts w:ascii="Times New Roman" w:hAnsi="Times New Roman" w:cs="Times New Roman"/>
+              </w:rPr>
+            </w:pPr>
+            <w:r>
+              <w:rPr>
+                <w:rFonts w:ascii="Times New Roman" w:hAnsi="Times New Roman" w:cs="Times New Roman"/>
+              </w:rPr>
+              <w:t>(Kelden Jamtsho)</w:t>
+            </w:r>
+          </w:p>
+        </w:tc>
+      </w:tr>
+      <w:tr>
+        <w:tblPrEx>
+          <w:tblCellMar>
+            <w:top w:w="0" w:type="dxa"/>
+            <w:bottom w:w="0" w:type="dxa"/>
+          </w:tblCellMar>
+        </w:tblPrEx>
+        <w:tc>
+          <w:tcPr>
+            <w:tcW w:w="3600" w:type="dxa"/>
+            <w:tcBorders>
+              <w:top w:val="single" w:sz="4" w:space="0" w:color="999999"/>
+              <w:left w:val="single" w:sz="4" w:space="0" w:color="999999"/>
+              <w:bottom w:val="single" w:sz="4" w:space="0" w:color="999999"/>
+              <w:right w:val="single" w:sz="4" w:space="0" w:color="999999"/>
+            </w:tcBorders>
+            <w:tcMar>
+              <w:top w:w="80" w:type="dxa"/>
+              <w:left w:w="120" w:type="dxa"/>
+              <w:bottom w:w="80" w:type="dxa"/>
+              <w:right w:w="120" w:type="dxa"/>
+            </w:tcMar>
+          </w:tcPr>
+          <w:p>
+            <w:pPr>
+              <w:jc w:val="both"/>
+              <w:rPr>
+                <w:rFonts w:ascii="Times New Roman" w:hAnsi="Times New Roman" w:cs="Times New Roman"/>
+              </w:rPr>
+            </w:pPr>
+            <w:r>
+              <w:rPr>
+                <w:rFonts w:ascii="Times New Roman" w:hAnsi="Times New Roman" w:cs="Times New Roman"/>
+                <w:b/>
+                <w:bCs/>
+              </w:rPr>
+              <w:t>Module 04</w:t>
+            </w:r>
+          </w:p>
+        </w:tc>
+        <w:tc>
+          <w:tcPr>
+            <w:tcW w:w="1500" w:type="dxa"/>
+            <w:tcBorders>
+              <w:top w:val="single" w:sz="4" w:space="0" w:color="999999"/>
+              <w:left w:val="single" w:sz="4" w:space="0" w:color="999999"/>
+              <w:bottom w:val="single" w:sz="4" w:space="0" w:color="999999"/>
+              <w:right w:val="single" w:sz="4" w:space="0" w:color="999999"/>
+            </w:tcBorders>
+            <w:tcMar>
+              <w:top w:w="80" w:type="dxa"/>
+              <w:left w:w="120" w:type="dxa"/>
+              <w:bottom w:w="80" w:type="dxa"/>
+              <w:right w:w="120" w:type="dxa"/>
+            </w:tcMar>
+          </w:tcPr>
+          <w:p>
+            <w:pPr>
+              <w:jc w:val="both"/>
+              <w:rPr>
+                <w:rFonts w:ascii="Times New Roman" w:hAnsi="Times New Roman" w:cs="Times New Roman"/>
+              </w:rPr>
+            </w:pPr>
+            <w:r>
+              <w:rPr>
+                <w:rFonts w:ascii="Times New Roman" w:hAnsi="Times New Roman" w:cs="Times New Roman"/>
+              </w:rPr>
+              <w:t>Lab04</w:t>
+            </w:r>
+          </w:p>
+        </w:tc>
+        <w:tc>
+          <w:tcPr>
+            <w:tcW w:w="3926" w:type="dxa"/>
+            <w:tcBorders>
+              <w:top w:val="single" w:sz="4" w:space="0" w:color="999999"/>
+              <w:left w:val="single" w:sz="4" w:space="0" w:color="999999"/>
+              <w:bottom w:val="single" w:sz="4" w:space="0" w:color="999999"/>
+              <w:right w:val="single" w:sz="4" w:space="0" w:color="999999"/>
+            </w:tcBorders>
+            <w:tcMar>
+              <w:top w:w="80" w:type="dxa"/>
+              <w:left w:w="120" w:type="dxa"/>
+              <w:bottom w:w="80" w:type="dxa"/>
+              <w:right w:w="120" w:type="dxa"/>
+            </w:tcMar>
+          </w:tcPr>
+          <w:p>
+            <w:pPr>
+              <w:jc w:val="both"/>
+              <w:rPr>
+                <w:rFonts w:ascii="Times New Roman" w:hAnsi="Times New Roman" w:cs="Times New Roman"/>
+              </w:rPr>
+            </w:pPr>
+            <w:r>
+              <w:rPr>
+                <w:rFonts w:ascii="Times New Roman" w:hAnsi="Times New Roman" w:cs="Times New Roman"/>
+              </w:rPr>
+              <w:t>(Kelden Jamtsho)</w:t>
+            </w:r>
+          </w:p>
+        </w:tc>
+      </w:tr>
+      <w:tr>
+        <w:tblPrEx>
+          <w:tblCellMar>
+            <w:top w:w="0" w:type="dxa"/>
+            <w:bottom w:w="0" w:type="dxa"/>
+          </w:tblCellMar>
+        </w:tblPrEx>
+        <w:tc>
+          <w:tcPr>
+            <w:tcW w:w="3600" w:type="dxa"/>
+            <w:tcBorders>
+              <w:top w:val="single" w:sz="4" w:space="0" w:color="999999"/>
+              <w:left w:val="single" w:sz="4" w:space="0" w:color="999999"/>
+              <w:bottom w:val="single" w:sz="4" w:space="0" w:color="999999"/>
+              <w:right w:val="single" w:sz="4" w:space="0" w:color="999999"/>
+            </w:tcBorders>
+            <w:tcMar>
+              <w:top w:w="80" w:type="dxa"/>
+              <w:left w:w="120" w:type="dxa"/>
+              <w:bottom w:w="80" w:type="dxa"/>
+              <w:right w:w="120" w:type="dxa"/>
+            </w:tcMar>
+          </w:tcPr>
+          <w:p>
+            <w:pPr>
+              <w:jc w:val="both"/>
+              <w:rPr>
+                <w:rFonts w:ascii="Times New Roman" w:hAnsi="Times New Roman" w:cs="Times New Roman"/>
+              </w:rPr>
+            </w:pPr>
+            <w:r>
+              <w:rPr>
+                <w:rFonts w:ascii="Times New Roman" w:hAnsi="Times New Roman" w:cs="Times New Roman"/>
+                <w:b/>
+                <w:bCs/>
+              </w:rPr>
+              <w:t>Module 05 Practice Project</w:t>
+            </w:r>
+          </w:p>
+        </w:tc>
+        <w:tc>
+          <w:tcPr>
+            <w:tcW w:w="1500" w:type="dxa"/>
+            <w:tcBorders>
+              <w:top w:val="single" w:sz="4" w:space="0" w:color="999999"/>
+              <w:left w:val="single" w:sz="4" w:space="0" w:color="999999"/>
+              <w:bottom w:val="single" w:sz="4" w:space="0" w:color="999999"/>
+              <w:right w:val="single" w:sz="4" w:space="0" w:color="999999"/>
+            </w:tcBorders>
+            <w:tcMar>
+              <w:top w:w="80" w:type="dxa"/>
+              <w:left w:w="120" w:type="dxa"/>
+              <w:bottom w:w="80" w:type="dxa"/>
+              <w:right w:w="120" w:type="dxa"/>
+            </w:tcMar>
+          </w:tcPr>
+          <w:p>
+            <w:pPr>
+              <w:jc w:val="both"/>
+              <w:rPr>
+                <w:rFonts w:ascii="Times New Roman" w:hAnsi="Times New Roman" w:cs="Times New Roman"/>
+              </w:rPr>
+            </w:pPr>
+            <w:r>
+              <w:rPr>
+                <w:rFonts w:ascii="Times New Roman" w:hAnsi="Times New Roman" w:cs="Times New Roman"/>
+              </w:rPr>
+              <w:t>Lab01</w:t>
+            </w:r>
+          </w:p>
+        </w:tc>
+        <w:tc>
+          <w:tcPr>
+            <w:tcW w:w="3926" w:type="dxa"/>
+            <w:tcBorders>
+              <w:top w:val="single" w:sz="4" w:space="0" w:color="999999"/>
+              <w:left w:val="single" w:sz="4" w:space="0" w:color="999999"/>
+              <w:bottom w:val="single" w:sz="4" w:space="0" w:color="999999"/>
+              <w:right w:val="single" w:sz="4" w:space="0" w:color="999999"/>
+            </w:tcBorders>
+            <w:tcMar>
+              <w:top w:w="80" w:type="dxa"/>
+              <w:left w:w="120" w:type="dxa"/>
+              <w:bottom w:w="80" w:type="dxa"/>
+              <w:right w:w="120" w:type="dxa"/>
+            </w:tcMar>
+          </w:tcPr>
+          <w:p>
+            <w:pPr>
+              <w:jc w:val="both"/>
+              <w:rPr>
+                <w:rFonts w:ascii="Times New Roman" w:hAnsi="Times New Roman" w:cs="Times New Roman"/>
+              </w:rPr>
+            </w:pPr>
+            <w:r>
+              <w:rPr>
+                <w:rFonts w:ascii="Times New Roman" w:hAnsi="Times New Roman" w:cs="Times New Roman"/>
+              </w:rPr>
+              <w:t>(UN CHI KIT)</w:t>
+            </w:r>
+          </w:p>
+        </w:tc>
+      </w:tr>
+      <w:tr>
+        <w:tblPrEx>
+          <w:tblCellMar>
+            <w:top w:w="0" w:type="dxa"/>
+            <w:bottom w:w="0" w:type="dxa"/>
+          </w:tblCellMar>
+        </w:tblPrEx>
+        <w:tc>
+          <w:tcPr>
+            <w:tcW w:w="3600" w:type="dxa"/>
+            <w:tcBorders>
+              <w:top w:val="single" w:sz="4" w:space="0" w:color="999999"/>
+              <w:left w:val="single" w:sz="4" w:space="0" w:color="999999"/>
+              <w:bottom w:val="single" w:sz="4" w:space="0" w:color="999999"/>
+              <w:right w:val="single" w:sz="4" w:space="0" w:color="999999"/>
+            </w:tcBorders>
+            <w:tcMar>
+              <w:top w:w="80" w:type="dxa"/>
+              <w:left w:w="120" w:type="dxa"/>
+              <w:bottom w:w="80" w:type="dxa"/>
+              <w:right w:w="120" w:type="dxa"/>
+            </w:tcMar>
+          </w:tcPr>
+          <w:p>
+            <w:pPr>
+              <w:jc w:val="both"/>
+              <w:rPr>
+                <w:rFonts w:ascii="Times New Roman" w:hAnsi="Times New Roman" w:cs="Times New Roman"/>
+              </w:rPr>
+            </w:pPr>
+            <w:r>
+              <w:rPr>
+                <w:rFonts w:ascii="Times New Roman" w:hAnsi="Times New Roman" w:cs="Times New Roman"/>
+                <w:b/>
+                <w:bCs/>
+              </w:rPr>
+              <w:t>Module 05 Practice Project</w:t>
+            </w:r>
+          </w:p>
+        </w:tc>
+        <w:tc>
+          <w:tcPr>
+            <w:tcW w:w="1500" w:type="dxa"/>
+            <w:tcBorders>
+              <w:top w:val="single" w:sz="4" w:space="0" w:color="999999"/>
+              <w:left w:val="single" w:sz="4" w:space="0" w:color="999999"/>
+              <w:bottom w:val="single" w:sz="4" w:space="0" w:color="999999"/>
+              <w:right w:val="single" w:sz="4" w:space="0" w:color="999999"/>
+            </w:tcBorders>
+            <w:tcMar>
+              <w:top w:w="80" w:type="dxa"/>
+              <w:left w:w="120" w:type="dxa"/>
+              <w:bottom w:w="80" w:type="dxa"/>
+              <w:right w:w="120" w:type="dxa"/>
+            </w:tcMar>
+          </w:tcPr>
+          <w:p>
+            <w:pPr>
+              <w:jc w:val="both"/>
+              <w:rPr>
+                <w:rFonts w:ascii="Times New Roman" w:hAnsi="Times New Roman" w:cs="Times New Roman"/>
+              </w:rPr>
+            </w:pPr>
+            <w:r>
+              <w:rPr>
+                <w:rFonts w:ascii="Times New Roman" w:hAnsi="Times New Roman" w:cs="Times New Roman"/>
+              </w:rPr>
+              <w:t>Lab02</w:t>
+            </w:r>
+          </w:p>
+        </w:tc>
+        <w:tc>
+          <w:tcPr>
+            <w:tcW w:w="3926" w:type="dxa"/>
+            <w:tcBorders>
+              <w:top w:val="single" w:sz="4" w:space="0" w:color="999999"/>
+              <w:left w:val="single" w:sz="4" w:space="0" w:color="999999"/>
+              <w:bottom w:val="single" w:sz="4" w:space="0" w:color="999999"/>
+              <w:right w:val="single" w:sz="4" w:space="0" w:color="999999"/>
+            </w:tcBorders>
+            <w:tcMar>
+              <w:top w:w="80" w:type="dxa"/>
+              <w:left w:w="120" w:type="dxa"/>
+              <w:bottom w:w="80" w:type="dxa"/>
+              <w:right w:w="120" w:type="dxa"/>
+            </w:tcMar>
+          </w:tcPr>
+          <w:p>
+            <w:pPr>
+              <w:jc w:val="both"/>
+              <w:rPr>
+                <w:rFonts w:ascii="Times New Roman" w:hAnsi="Times New Roman" w:cs="Times New Roman"/>
+              </w:rPr>
+            </w:pPr>
+            <w:r>
+              <w:rPr>
+                <w:rFonts w:ascii="Times New Roman" w:hAnsi="Times New Roman" w:cs="Times New Roman"/>
+              </w:rPr>
+              <w:t>(Kelden Jamtsho)</w:t>
+            </w:r>
+          </w:p>
+        </w:tc>
+      </w:tr>
+      <w:tr>
+        <w:tblPrEx>
+          <w:tblCellMar>
+            <w:top w:w="0" w:type="dxa"/>
+            <w:bottom w:w="0" w:type="dxa"/>
+          </w:tblCellMar>
+        </w:tblPrEx>
+        <w:tc>
+          <w:tcPr>
+            <w:tcW w:w="3600" w:type="dxa"/>
+            <w:tcBorders>
+              <w:top w:val="single" w:sz="4" w:space="0" w:color="999999"/>
+              <w:left w:val="single" w:sz="4" w:space="0" w:color="999999"/>
+              <w:bottom w:val="single" w:sz="4" w:space="0" w:color="999999"/>
+              <w:right w:val="single" w:sz="4" w:space="0" w:color="999999"/>
+            </w:tcBorders>
+            <w:tcMar>
+              <w:top w:w="80" w:type="dxa"/>
+              <w:left w:w="120" w:type="dxa"/>
+              <w:bottom w:w="80" w:type="dxa"/>
+              <w:right w:w="120" w:type="dxa"/>
+            </w:tcMar>
+          </w:tcPr>
+          <w:p>
+            <w:pPr>
+              <w:jc w:val="both"/>
+              <w:rPr>
+                <w:rFonts w:ascii="Times New Roman" w:hAnsi="Times New Roman" w:cs="Times New Roman"/>
+              </w:rPr>
+            </w:pPr>
+            <w:r>
+              <w:rPr>
+                <w:rFonts w:ascii="Times New Roman" w:hAnsi="Times New Roman" w:cs="Times New Roman"/>
+                <w:b/>
+                <w:bCs/>
+              </w:rPr>
+              <w:t>Module 05 Final Project</w:t>
+            </w:r>
+          </w:p>
+        </w:tc>
+        <w:tc>
+          <w:tcPr>
+            <w:tcW w:w="1500" w:type="dxa"/>
+            <w:tcBorders>
+              <w:top w:val="single" w:sz="4" w:space="0" w:color="999999"/>
+              <w:left w:val="single" w:sz="4" w:space="0" w:color="999999"/>
+              <w:bottom w:val="single" w:sz="4" w:space="0" w:color="999999"/>
+              <w:right w:val="single" w:sz="4" w:space="0" w:color="999999"/>
+            </w:tcBorders>
+            <w:tcMar>
+              <w:top w:w="80" w:type="dxa"/>
+              <w:left w:w="120" w:type="dxa"/>
+              <w:bottom w:w="80" w:type="dxa"/>
+              <w:right w:w="120" w:type="dxa"/>
+            </w:tcMar>
+          </w:tcPr>
+          <w:p>
+            <w:pPr>
+              <w:jc w:val="both"/>
+              <w:rPr>
+                <w:rFonts w:ascii="Times New Roman" w:hAnsi="Times New Roman" w:cs="Times New Roman"/>
+              </w:rPr>
+            </w:pPr>
+            <w:r>
+              <w:rPr>
+                <w:rFonts w:ascii="Times New Roman" w:hAnsi="Times New Roman" w:cs="Times New Roman"/>
+              </w:rPr>
+              <w:t>Lab01</w:t>
+            </w:r>
+          </w:p>
+        </w:tc>
+        <w:tc>
+          <w:tcPr>
+            <w:tcW w:w="3926" w:type="dxa"/>
+            <w:tcBorders>
+              <w:top w:val="single" w:sz="4" w:space="0" w:color="999999"/>
+              <w:left w:val="single" w:sz="4" w:space="0" w:color="999999"/>
+              <w:bottom w:val="single" w:sz="4" w:space="0" w:color="999999"/>
+              <w:right w:val="single" w:sz="4" w:space="0" w:color="999999"/>
+            </w:tcBorders>
+            <w:tcMar>
+              <w:top w:w="80" w:type="dxa"/>
+              <w:left w:w="120" w:type="dxa"/>
+              <w:bottom w:w="80" w:type="dxa"/>
+              <w:right w:w="120" w:type="dxa"/>
+            </w:tcMar>
+          </w:tcPr>
+          <w:p>
+            <w:pPr>
+              <w:jc w:val="both"/>
+              <w:rPr>
+                <w:rFonts w:ascii="Times New Roman" w:hAnsi="Times New Roman" w:cs="Times New Roman"/>
+              </w:rPr>
+            </w:pPr>
+            <w:r>
+              <w:rPr>
+                <w:rFonts w:ascii="Times New Roman" w:hAnsi="Times New Roman" w:cs="Times New Roman"/>
+              </w:rPr>
+              <w:t>(Kelden Jamtsho)</w:t>
+            </w:r>
+          </w:p>
+        </w:tc>
+      </w:tr>
+      <w:tr>
+        <w:tblPrEx>
+          <w:tblCellMar>
+            <w:top w:w="0" w:type="dxa"/>
+            <w:bottom w:w="0" w:type="dxa"/>
+          </w:tblCellMar>
+        </w:tblPrEx>
+        <w:tc>
+          <w:tcPr>
+            <w:tcW w:w="3600" w:type="dxa"/>
+            <w:tcBorders>
+              <w:top w:val="single" w:sz="4" w:space="0" w:color="999999"/>
+              <w:left w:val="single" w:sz="4" w:space="0" w:color="999999"/>
+              <w:bottom w:val="single" w:sz="4" w:space="0" w:color="999999"/>
+              <w:right w:val="single" w:sz="4" w:space="0" w:color="999999"/>
+            </w:tcBorders>
+            <w:tcMar>
+              <w:top w:w="80" w:type="dxa"/>
+              <w:left w:w="120" w:type="dxa"/>
+              <w:bottom w:w="80" w:type="dxa"/>
+              <w:right w:w="120" w:type="dxa"/>
+            </w:tcMar>
+          </w:tcPr>
+          <w:p>
+            <w:pPr>
+              <w:jc w:val="both"/>
+              <w:rPr>
+                <w:rFonts w:ascii="Times New Roman" w:hAnsi="Times New Roman" w:cs="Times New Roman"/>
+              </w:rPr>
+            </w:pPr>
+            <w:r>
+              <w:rPr>
+                <w:rFonts w:ascii="Times New Roman" w:hAnsi="Times New Roman" w:cs="Times New Roman"/>
+                <w:b/>
+                <w:bCs/>
+              </w:rPr>
+              <w:t>Module 05 Final Project</w:t>
+            </w:r>
+          </w:p>
+        </w:tc>
+        <w:tc>
+          <w:tcPr>
+            <w:tcW w:w="1500" w:type="dxa"/>
+            <w:tcBorders>
+              <w:top w:val="single" w:sz="4" w:space="0" w:color="999999"/>
+              <w:left w:val="single" w:sz="4" w:space="0" w:color="999999"/>
+              <w:bottom w:val="single" w:sz="4" w:space="0" w:color="999999"/>
+              <w:right w:val="single" w:sz="4" w:space="0" w:color="999999"/>
+            </w:tcBorders>
+            <w:tcMar>
+              <w:top w:w="80" w:type="dxa"/>
+              <w:left w:w="120" w:type="dxa"/>
+              <w:bottom w:w="80" w:type="dxa"/>
+              <w:right w:w="120" w:type="dxa"/>
+            </w:tcMar>
+          </w:tcPr>
+          <w:p>
+            <w:pPr>
+              <w:jc w:val="both"/>
+              <w:rPr>
+                <w:rFonts w:ascii="Times New Roman" w:hAnsi="Times New Roman" w:cs="Times New Roman"/>
+              </w:rPr>
+            </w:pPr>
+            <w:r>
+              <w:rPr>
+                <w:rFonts w:ascii="Times New Roman" w:hAnsi="Times New Roman" w:cs="Times New Roman"/>
+              </w:rPr>
+              <w:t>Lab02</w:t>
+            </w:r>
+          </w:p>
+        </w:tc>
+        <w:tc>
+          <w:tcPr>
+            <w:tcW w:w="3926" w:type="dxa"/>
+            <w:tcBorders>
+              <w:top w:val="single" w:sz="4" w:space="0" w:color="999999"/>
+              <w:left w:val="single" w:sz="4" w:space="0" w:color="999999"/>
+              <w:bottom w:val="single" w:sz="4" w:space="0" w:color="999999"/>
+              <w:right w:val="single" w:sz="4" w:space="0" w:color="999999"/>
+            </w:tcBorders>
+            <w:tcMar>
+              <w:top w:w="80" w:type="dxa"/>
+              <w:left w:w="120" w:type="dxa"/>
+              <w:bottom w:w="80" w:type="dxa"/>
+              <w:right w:w="120" w:type="dxa"/>
+            </w:tcMar>
+          </w:tcPr>
+          <w:p>
+            <w:pPr>
+              <w:jc w:val="both"/>
+              <w:rPr>
+                <w:rFonts w:ascii="Times New Roman" w:hAnsi="Times New Roman" w:cs="Times New Roman"/>
+              </w:rPr>
+            </w:pPr>
+            <w:r>
+              <w:rPr>
+                <w:rFonts w:ascii="Times New Roman" w:hAnsi="Times New Roman" w:cs="Times New Roman"/>
+              </w:rPr>
+              <w:t>(UN CHI KIT)</w:t>
+            </w:r>
+          </w:p>
+        </w:tc>
+      </w:tr>
+    </w:tbl>
+    <w:p>
+      <w:pPr>
+        <w:pStyle w:val="Heading1"/>
+        <w:rPr>
+          <w:rFonts w:ascii="Times New Roman" w:hAnsi="Times New Roman" w:cs="Times New Roman"/>
+          <w:sz w:val="32"/>
+          <w:szCs w:val="32"/>
+        </w:rPr>
+      </w:pPr>
+      <w:r>
+        <w:rPr>
+          <w:rFonts w:ascii="Times New Roman" w:hAnsi="Times New Roman" w:cs="Times New Roman"/>
+          <w:sz w:val="32"/>
+          <w:szCs w:val="32"/>
+        </w:rPr>
+        <w:lastRenderedPageBreak/>
         <w:t>Quality Assurance and Ground Rules</w:t>
       </w:r>
     </w:p>
     <w:p>
       <w:pPr>
+        <w:pStyle w:val="ListParagraph"/>
         <w:numPr>
           <w:ilvl w:val="0"/>
-          <w:numId w:val="1"/>
+          <w:numId w:val="2"/>
         </w:numPr>
-        <w:spacing w:before="100" w:beforeAutospacing="1" w:after="100" w:afterAutospacing="1" w:line="240" w:lineRule="auto"/>
+        <w:spacing w:after="240"/>
+        <w:contextualSpacing w:val="0"/>
         <w:jc w:val="both"/>
         <w:rPr>
-          <w:rFonts w:ascii="Times New Roman" w:eastAsia="Times New Roman" w:hAnsi="Times New Roman" w:cs="Times New Roman"/>
-          <w:kern w:val="0"/>
-          <w:lang w:eastAsia="en-GB"/>
-          <w14:ligatures w14:val="none"/>
+          <w:rFonts w:ascii="Times New Roman" w:hAnsi="Times New Roman" w:cs="Times New Roman"/>
         </w:rPr>
       </w:pPr>
       <w:r>
         <w:rPr>
-          <w:rFonts w:ascii="Times New Roman" w:eastAsia="Times New Roman" w:hAnsi="Times New Roman" w:cs="Times New Roman"/>
-          <w:kern w:val="0"/>
-          <w:lang w:eastAsia="en-GB"/>
-          <w14:ligatures w14:val="none"/>
+          <w:rFonts w:ascii="Times New Roman" w:hAnsi="Times New Roman" w:cs="Times New Roman"/>
         </w:rPr>
         <w:t>Review code, calculations, visualizations, and written interpretations before submission.</w:t>
       </w:r>
     </w:p>
     <w:p>
       <w:pPr>
+        <w:pStyle w:val="ListParagraph"/>
         <w:numPr>
           <w:ilvl w:val="0"/>
-          <w:numId w:val="1"/>
+          <w:numId w:val="2"/>
         </w:numPr>
-        <w:spacing w:before="100" w:beforeAutospacing="1" w:after="100" w:afterAutospacing="1" w:line="240" w:lineRule="auto"/>
+        <w:spacing w:after="240"/>
+        <w:contextualSpacing w:val="0"/>
         <w:jc w:val="both"/>
         <w:rPr>
-          <w:rFonts w:ascii="Times New Roman" w:eastAsia="Times New Roman" w:hAnsi="Times New Roman" w:cs="Times New Roman"/>
-          <w:kern w:val="0"/>
-          <w:lang w:eastAsia="en-GB"/>
-          <w14:ligatures w14:val="none"/>
+          <w:rFonts w:ascii="Times New Roman" w:hAnsi="Times New Roman" w:cs="Times New Roman"/>
         </w:rPr>
       </w:pPr>
       <w:r>
         <w:rPr>
-          <w:rFonts w:ascii="Times New Roman" w:eastAsia="Times New Roman" w:hAnsi="Times New Roman" w:cs="Times New Roman"/>
-          <w:kern w:val="0"/>
-          <w:lang w:eastAsia="en-GB"/>
-          <w14:ligatures w14:val="none"/>
+          <w:rFonts w:ascii="Times New Roman" w:hAnsi="Times New Roman" w:cs="Times New Roman"/>
         </w:rPr>
         <w:t>Document relevant data-processing steps, analytical decisions, and code changes.</w:t>
       </w:r>
     </w:p>
     <w:p>
       <w:pPr>
+        <w:pStyle w:val="ListParagraph"/>
         <w:numPr>
           <w:ilvl w:val="0"/>
-          <w:numId w:val="1"/>
+          <w:numId w:val="2"/>
         </w:numPr>
-        <w:spacing w:before="100" w:beforeAutospacing="1" w:after="100" w:afterAutospacing="1" w:line="240" w:lineRule="auto"/>
+        <w:spacing w:after="240"/>
+        <w:contextualSpacing w:val="0"/>
         <w:jc w:val="both"/>
         <w:rPr>
-          <w:rFonts w:ascii="Times New Roman" w:eastAsia="Times New Roman" w:hAnsi="Times New Roman" w:cs="Times New Roman"/>
-          <w:kern w:val="0"/>
-          <w:lang w:eastAsia="en-GB"/>
-          <w14:ligatures w14:val="none"/>
+          <w:rFonts w:ascii="Times New Roman" w:hAnsi="Times New Roman" w:cs="Times New Roman"/>
         </w:rPr>
       </w:pPr>
       <w:r>
         <w:rPr>
-          <w:rFonts w:ascii="Times New Roman" w:eastAsia="Times New Roman" w:hAnsi="Times New Roman" w:cs="Times New Roman"/>
-          <w:kern w:val="0"/>
-          <w:lang w:eastAsia="en-GB"/>
-          <w14:ligatures w14:val="none"/>
+          <w:rFonts w:ascii="Times New Roman" w:hAnsi="Times New Roman" w:cs="Times New Roman"/>
         </w:rPr>
         <w:t>Ensure conclusions are supported by the analysis and distinguish statistical association from causation.</w:t>
       </w:r>
     </w:p>
     <w:p>
       <w:pPr>
+        <w:pStyle w:val="ListParagraph"/>
         <w:numPr>
           <w:ilvl w:val="0"/>
-          <w:numId w:val="1"/>
+          <w:numId w:val="2"/>
         </w:numPr>
-        <w:spacing w:before="100" w:beforeAutospacing="1" w:after="100" w:afterAutospacing="1" w:line="240" w:lineRule="auto"/>
+        <w:spacing w:after="240"/>
+        <w:contextualSpacing w:val="0"/>
         <w:jc w:val="both"/>
         <w:rPr>
-          <w:rFonts w:ascii="Times New Roman" w:eastAsia="Times New Roman" w:hAnsi="Times New Roman" w:cs="Times New Roman"/>
-          <w:kern w:val="0"/>
-          <w:lang w:eastAsia="en-GB"/>
-          <w14:ligatures w14:val="none"/>
+          <w:rFonts w:ascii="Times New Roman" w:hAnsi="Times New Roman" w:cs="Times New Roman"/>
         </w:rPr>
       </w:pPr>
       <w:r>
         <w:rPr>
-          <w:rFonts w:ascii="Times New Roman" w:eastAsia="Times New Roman" w:hAnsi="Times New Roman" w:cs="Times New Roman"/>
-          <w:kern w:val="0"/>
-          <w:lang w:eastAsia="en-GB"/>
-          <w14:ligatures w14:val="none"/>
+          <w:rFonts w:ascii="Times New Roman" w:hAnsi="Times New Roman" w:cs="Times New Roman"/>
         </w:rPr>
         <w:t>Maintain clear communication and resolve technical issues collaboratively.</w:t>
       </w:r>
     </w:p>
     <w:p>
       <w:pPr>
+        <w:pStyle w:val="ListParagraph"/>
         <w:numPr>
           <w:ilvl w:val="0"/>
-          <w:numId w:val="1"/>
+          <w:numId w:val="2"/>
         </w:numPr>
-        <w:spacing w:before="100" w:beforeAutospacing="1" w:after="100" w:afterAutospacing="1" w:line="240" w:lineRule="auto"/>
+        <w:spacing w:after="240"/>
+        <w:contextualSpacing w:val="0"/>
         <w:jc w:val="both"/>
         <w:rPr>
-          <w:rFonts w:ascii="Times New Roman" w:eastAsia="Times New Roman" w:hAnsi="Times New Roman" w:cs="Times New Roman"/>
-          <w:kern w:val="0"/>
-          <w:lang w:eastAsia="en-GB"/>
-          <w14:ligatures w14:val="none"/>
+          <w:rFonts w:ascii="Times New Roman" w:hAnsi="Times New Roman" w:cs="Times New Roman"/>
         </w:rPr>
       </w:pPr>
       <w:r>
         <w:rPr>
-          <w:rFonts w:ascii="Times New Roman" w:eastAsia="Times New Roman" w:hAnsi="Times New Roman" w:cs="Times New Roman"/>
-          <w:kern w:val="0"/>
-          <w:lang w:eastAsia="en-GB"/>
-          <w14:ligatures w14:val="none"/>
+          <w:rFonts w:ascii="Times New Roman" w:hAnsi="Times New Roman" w:cs="Times New Roman"/>
         </w:rPr>
         <w:t>Conduct a final joint review to confirm completeness, consistency, and compliance with assignment requirements.</w:t>
       </w:r>
     </w:p>
+    <w:p/>
     <w:sectPr>
       <w:pgSz w:w="11906" w:h="16838"/>
       <w:pgMar w:top="1440" w:right="1440" w:bottom="1440" w:left="1440" w:header="708" w:footer="708" w:gutter="0"/>
-      <w:cols w:space="708"/>
+      <w:cols w:space="720"/>
       <w:docGrid w:linePitch="360"/>
     </w:sectPr>
   </w:body>
@@ -907,6 +3422,60 @@
 <file path=word/numbering.xml><?xml version="1.0" encoding="utf-8"?>
 <w:numbering xmlns:wpc="http://schemas.microsoft.com/office/word/2010/wordprocessingCanvas" xmlns:cx="http://schemas.microsoft.com/office/drawing/2014/chartex" xmlns:cx1="http://schemas.microsoft.com/office/drawing/2015/9/8/chartex" xmlns:cx2="http://schemas.microsoft.com/office/drawing/2015/10/21/chartex" xmlns:cx3="http://schemas.microsoft.com/office/drawing/2016/5/9/chartex" xmlns:cx4="http://schemas.microsoft.com/office/drawing/2016/5/10/chartex" xmlns:cx5="http://schemas.microsoft.com/office/drawing/2016/5/11/chartex" xmlns:cx6="http://schemas.microsoft.com/office/drawing/2016/5/12/chartex" xmlns:cx7="http://schemas.microsoft.com/office/drawing/2016/5/13/chartex" xmlns:cx8="http://schemas.microsoft.com/office/drawing/2016/5/14/chartex" xmlns:mc="http://schemas.openxmlformats.org/markup-compatibility/2006" xmlns:m="http://schemas.openxmlformats.org/officeDocument/2006/math" xmlns:aink="http://schemas.microsoft.com/office/drawing/2016/ink" xmlns:am3d="http://schemas.microsoft.com/office/drawing/2017/model3d" xmlns:oel="http://schemas.microsoft.com/office/2019/extlst" xmlns:r="http://schemas.openxmlformats.org/officeDocument/2006/relationships" xmlns:wp14="http://schemas.microsoft.com/office/word/2010/wordprocessingDrawing" xmlns:wp="http://schemas.openxmlformats.org/drawingml/2006/wordprocessingDrawing" xmlns:wpg="http://schemas.microsoft.com/office/word/2010/wordprocessingGroup" xmlns:wpi="http://schemas.microsoft.com/office/word/2010/wordprocessingInk" xmlns:wps="http://schemas.microsoft.com/office/word/2010/wordprocessingShape" xmlns:o="urn:schemas-microsoft-com:office:office" xmlns:v="urn:schemas-microsoft-com:vml" xmlns:w10="urn:schemas-microsoft-com:office:word" xmlns:w="http://schemas.openxmlformats.org/wordprocessingml/2006/main" xmlns:w14="http://schemas.microsoft.com/office/word/2010/wordml" xmlns:w15="http://schemas.microsoft.com/office/word/2012/wordml" xmlns:w16cex="http://schemas.microsoft.com/office/word/2018/wordml/cex" xmlns:w16cid="http://schemas.microsoft.com/office/word/2016/wordml/cid" xmlns:w16="http://schemas.microsoft.com/office/word/2018/wordml" xmlns:w16sdtdh="http://schemas.microsoft.com/office/word/2020/wordml/sdtdatahash" xmlns:w16sdtfl="http://schemas.microsoft.com/office/word/2024/wordml/sdtformatlock" xmlns:w16se="http://schemas.microsoft.com/office/word/2015/wordml/symex" xmlns:w16du="http://schemas.microsoft.com/office/word/2023/wordml/word16du" xmlns:wne="http://schemas.microsoft.com/office/word/2006/wordml" mc:Ignorable="w14 w15 w16se w16cid w16 w16cex w16sdtdh w16sdtfl w16du wp14">
   <w:abstractNum w:abstractNumId="0" w15:restartNumberingAfterBreak="0">
+    <w:nsid w:val="1BA12B7D"/>
+    <w:multiLevelType w:val="hybridMultilevel"/>
+    <w:tmpl w:val="1E1CA008"/>
+    <w:lvl w:ilvl="0" w:tplc="0018F68C">
+      <w:start w:val="1"/>
+      <w:numFmt w:val="bullet"/>
+      <w:lvlText w:val="•"/>
+      <w:lvlJc w:val="left"/>
+      <w:pPr>
+        <w:ind w:left="720" w:hanging="360"/>
+      </w:pPr>
+    </w:lvl>
+    <w:lvl w:ilvl="1" w:tplc="0B6EFDE6">
+      <w:numFmt w:val="decimal"/>
+      <w:lvlText w:val=""/>
+      <w:lvlJc w:val="left"/>
+    </w:lvl>
+    <w:lvl w:ilvl="2" w:tplc="0090090C">
+      <w:numFmt w:val="decimal"/>
+      <w:lvlText w:val=""/>
+      <w:lvlJc w:val="left"/>
+    </w:lvl>
+    <w:lvl w:ilvl="3" w:tplc="9320BD96">
+      <w:numFmt w:val="decimal"/>
+      <w:lvlText w:val=""/>
+      <w:lvlJc w:val="left"/>
+    </w:lvl>
+    <w:lvl w:ilvl="4" w:tplc="D5E44974">
+      <w:numFmt w:val="decimal"/>
+      <w:lvlText w:val=""/>
+      <w:lvlJc w:val="left"/>
+    </w:lvl>
+    <w:lvl w:ilvl="5" w:tplc="68527E36">
+      <w:numFmt w:val="decimal"/>
+      <w:lvlText w:val=""/>
+      <w:lvlJc w:val="left"/>
+    </w:lvl>
+    <w:lvl w:ilvl="6" w:tplc="796EE898">
+      <w:numFmt w:val="decimal"/>
+      <w:lvlText w:val=""/>
+      <w:lvlJc w:val="left"/>
+    </w:lvl>
+    <w:lvl w:ilvl="7" w:tplc="D78009BE">
+      <w:numFmt w:val="decimal"/>
+      <w:lvlText w:val=""/>
+      <w:lvlJc w:val="left"/>
+    </w:lvl>
+    <w:lvl w:ilvl="8" w:tplc="268C0CBE">
+      <w:numFmt w:val="decimal"/>
+      <w:lvlText w:val=""/>
+      <w:lvlJc w:val="left"/>
+    </w:lvl>
+  </w:abstractNum>
+  <w:abstractNum w:abstractNumId="1" w15:restartNumberingAfterBreak="0">
     <w:nsid w:val="264E3DAB"/>
     <w:multiLevelType w:val="multilevel"/>
     <w:tmpl w:val="FD8C8CC2"/>
@@ -1056,7 +3625,13 @@
     </w:lvl>
   </w:abstractNum>
   <w:num w:numId="1" w16cid:durableId="1112742491">
+    <w:abstractNumId w:val="1"/>
+  </w:num>
+  <w:num w:numId="2" w16cid:durableId="166410587">
     <w:abstractNumId w:val="0"/>
+    <w:lvlOverride w:ilvl="0">
+      <w:startOverride w:val="1"/>
+    </w:lvlOverride>
   </w:num>
 </w:numbering>
 </file>
@@ -1260,7 +3835,7 @@
     <w:lsdException w:name="Medium Shading 2 Accent 1" w:uiPriority="64"/>
     <w:lsdException w:name="Medium List 1 Accent 1" w:uiPriority="65"/>
     <w:lsdException w:name="Revision" w:semiHidden="1"/>
-    <w:lsdException w:name="List Paragraph" w:uiPriority="34" w:qFormat="1"/>
+    <w:lsdException w:name="List Paragraph" w:uiPriority="0" w:qFormat="1"/>
     <w:lsdException w:name="Quote" w:uiPriority="29" w:qFormat="1"/>
     <w:lsdException w:name="Intense Quote" w:uiPriority="30" w:qFormat="1"/>
     <w:lsdException w:name="Medium List 2 Accent 1" w:uiPriority="66"/>
@@ -1461,6 +4036,18 @@
   <w:style w:type="paragraph" w:default="1" w:styleId="Normal">
     <w:name w:val="Normal"/>
     <w:qFormat/>
+    <w:rsid w:val="001B1E23"/>
+    <w:pPr>
+      <w:spacing w:after="0" w:line="240" w:lineRule="auto"/>
+    </w:pPr>
+    <w:rPr>
+      <w:rFonts w:ascii="Calibri" w:eastAsia="Calibri" w:hAnsi="Calibri" w:cs="Calibri"/>
+      <w:kern w:val="0"/>
+      <w:sz w:val="22"/>
+      <w:szCs w:val="22"/>
+      <w:lang w:eastAsia="en-GB"/>
+      <w14:ligatures w14:val="none"/>
+    </w:rPr>
   </w:style>
   <w:style w:type="paragraph" w:styleId="Heading1">
     <w:name w:val="heading 1"/>
@@ -1585,7 +4172,7 @@
     <w:pPr>
       <w:keepNext/>
       <w:keepLines/>
-      <w:spacing w:before="40" w:after="0"/>
+      <w:spacing w:before="40"/>
       <w:outlineLvl w:val="5"/>
     </w:pPr>
     <w:rPr>
@@ -1608,7 +4195,7 @@
     <w:pPr>
       <w:keepNext/>
       <w:keepLines/>
-      <w:spacing w:before="40" w:after="0"/>
+      <w:spacing w:before="40"/>
       <w:outlineLvl w:val="6"/>
     </w:pPr>
     <w:rPr>
@@ -1629,7 +4216,6 @@
     <w:pPr>
       <w:keepNext/>
       <w:keepLines/>
-      <w:spacing w:after="0"/>
       <w:outlineLvl w:val="7"/>
     </w:pPr>
     <w:rPr>
@@ -1652,7 +4238,6 @@
     <w:pPr>
       <w:keepNext/>
       <w:keepLines/>
-      <w:spacing w:after="0"/>
       <w:outlineLvl w:val="8"/>
     </w:pPr>
     <w:rPr>
@@ -1814,7 +4399,7 @@
     <w:qFormat/>
     <w:rsid w:val="001536A2"/>
     <w:pPr>
-      <w:spacing w:after="80" w:line="240" w:lineRule="auto"/>
+      <w:spacing w:after="80"/>
       <w:contextualSpacing/>
     </w:pPr>
     <w:rPr>
@@ -1907,7 +4492,6 @@
   <w:style w:type="paragraph" w:styleId="ListParagraph">
     <w:name w:val="List Paragraph"/>
     <w:basedOn w:val="Normal"/>
-    <w:uiPriority w:val="34"/>
     <w:qFormat/>
     <w:rsid w:val="001536A2"/>
     <w:pPr>
@@ -1984,13 +4568,10 @@
     <w:unhideWhenUsed/>
     <w:rsid w:val="001536A2"/>
     <w:pPr>
-      <w:spacing w:before="100" w:beforeAutospacing="1" w:after="100" w:afterAutospacing="1" w:line="240" w:lineRule="auto"/>
+      <w:spacing w:before="100" w:beforeAutospacing="1" w:after="100" w:afterAutospacing="1"/>
     </w:pPr>
     <w:rPr>
       <w:rFonts w:ascii="Times New Roman" w:eastAsia="Times New Roman" w:hAnsi="Times New Roman" w:cs="Times New Roman"/>
-      <w:kern w:val="0"/>
-      <w:lang w:eastAsia="en-GB"/>
-      <w14:ligatures w14:val="none"/>
     </w:rPr>
   </w:style>
   <w:style w:type="character" w:styleId="Strong">
@@ -2158,6 +4739,28 @@
         <w:insideV w:val="single" w:sz="4" w:space="0" w:color="auto"/>
       </w:tblBorders>
     </w:tblPr>
+  </w:style>
+  <w:style w:type="character" w:styleId="Hyperlink">
+    <w:name w:val="Hyperlink"/>
+    <w:uiPriority w:val="99"/>
+    <w:unhideWhenUsed/>
+    <w:rsid w:val="001B1E23"/>
+    <w:rPr>
+      <w:color w:val="0563C1"/>
+      <w:u w:val="single"/>
+    </w:rPr>
+  </w:style>
+  <w:style w:type="character" w:styleId="FollowedHyperlink">
+    <w:name w:val="FollowedHyperlink"/>
+    <w:basedOn w:val="DefaultParagraphFont"/>
+    <w:uiPriority w:val="99"/>
+    <w:semiHidden/>
+    <w:unhideWhenUsed/>
+    <w:rsid w:val="001B1E23"/>
+    <w:rPr>
+      <w:color w:val="96607D" w:themeColor="followedHyperlink"/>
+      <w:u w:val="single"/>
+    </w:rPr>
   </w:style>
 </w:styles>
 </file>

</xml_diff>